<commit_message>
Added multiple clients support
</commit_message>
<xml_diff>
--- a/JOHN MOSQUEDA SR AND JOHN MOSQUEDA JR - SEPTEMBER 05, 2023.docx
+++ b/JOHN MOSQUEDA SR AND JOHN MOSQUEDA JR - SEPTEMBER 05, 2023.docx
@@ -1,6 +1,6 @@
 
 <file path=word/document.xml><?xml version="1.0" encoding="utf-8"?>
-<w:document xmlns:wpc="http://schemas.microsoft.com/office/word/2010/wordprocessingCanvas" xmlns:cx="http://schemas.microsoft.com/office/drawing/2014/chartex" xmlns:cx1="http://schemas.microsoft.com/office/drawing/2015/9/8/chartex" xmlns:cx2="http://schemas.microsoft.com/office/drawing/2015/10/21/chartex" xmlns:cx3="http://schemas.microsoft.com/office/drawing/2016/5/9/chartex" xmlns:cx4="http://schemas.microsoft.com/office/drawing/2016/5/10/chartex" xmlns:cx5="http://schemas.microsoft.com/office/drawing/2016/5/11/chartex" xmlns:cx6="http://schemas.microsoft.com/office/drawing/2016/5/12/chartex" xmlns:cx7="http://schemas.microsoft.com/office/drawing/2016/5/13/chartex" xmlns:cx8="http://schemas.microsoft.com/office/drawing/2016/5/14/chartex" xmlns:mc="http://schemas.openxmlformats.org/markup-compatibility/2006" xmlns:aink="http://schemas.microsoft.com/office/drawing/2016/ink" xmlns:am3d="http://schemas.microsoft.com/office/drawing/2017/model3d" xmlns:o="urn:schemas-microsoft-com:office:office" xmlns:oel="http://schemas.microsoft.com/office/2019/extlst" xmlns:r="http://schemas.openxmlformats.org/officeDocument/2006/relationships" xmlns:m="http://schemas.openxmlformats.org/officeDocument/2006/math" xmlns:v="urn:schemas-microsoft-com:vml" xmlns:wp14="http://schemas.microsoft.com/office/word/2010/wordprocessingDrawing" xmlns:wp="http://schemas.openxmlformats.org/drawingml/2006/wordprocessingDrawing" xmlns:w10="urn:schemas-microsoft-com:office:word" xmlns:w="http://schemas.openxmlformats.org/wordprocessingml/2006/main" xmlns:w14="http://schemas.microsoft.com/office/word/2010/wordml" xmlns:w15="http://schemas.microsoft.com/office/word/2012/wordml" xmlns:w16cex="http://schemas.microsoft.com/office/word/2018/wordml/cex" xmlns:w16cid="http://schemas.microsoft.com/office/word/2016/wordml/cid" xmlns:w16="http://schemas.microsoft.com/office/word/2018/wordml" xmlns:w16du="http://schemas.microsoft.com/office/word/2023/wordml/word16du" xmlns:w16sdtdh="http://schemas.microsoft.com/office/word/2020/wordml/sdtdatahash" xmlns:w16se="http://schemas.microsoft.com/office/word/2015/wordml/symex" xmlns:wpg="http://schemas.microsoft.com/office/word/2010/wordprocessingGroup" xmlns:wpi="http://schemas.microsoft.com/office/word/2010/wordprocessingInk" xmlns:wne="http://schemas.microsoft.com/office/word/2006/wordml" xmlns:wps="http://schemas.microsoft.com/office/word/2010/wordprocessingShape" mc:Ignorable="w14 w15 w16se w16cid w16 w16cex w16sdtdh w16du wp14">
+<w:document xmlns:wpc="http://schemas.microsoft.com/office/word/2010/wordprocessingCanvas" xmlns:cx="http://schemas.microsoft.com/office/drawing/2014/chartex" xmlns:cx1="http://schemas.microsoft.com/office/drawing/2015/9/8/chartex" xmlns:cx2="http://schemas.microsoft.com/office/drawing/2015/10/21/chartex" xmlns:cx3="http://schemas.microsoft.com/office/drawing/2016/5/9/chartex" xmlns:cx4="http://schemas.microsoft.com/office/drawing/2016/5/10/chartex" xmlns:cx5="http://schemas.microsoft.com/office/drawing/2016/5/11/chartex" xmlns:cx6="http://schemas.microsoft.com/office/drawing/2016/5/12/chartex" xmlns:cx7="http://schemas.microsoft.com/office/drawing/2016/5/13/chartex" xmlns:cx8="http://schemas.microsoft.com/office/drawing/2016/5/14/chartex" xmlns:mc="http://schemas.openxmlformats.org/markup-compatibility/2006" xmlns:aink="http://schemas.microsoft.com/office/drawing/2016/ink" xmlns:am3d="http://schemas.microsoft.com/office/drawing/2017/model3d" xmlns:o="urn:schemas-microsoft-com:office:office" xmlns:oel="http://schemas.microsoft.com/office/2019/extlst" xmlns:r="http://schemas.openxmlformats.org/officeDocument/2006/relationships" xmlns:m="http://schemas.openxmlformats.org/officeDocument/2006/math" xmlns:v="urn:schemas-microsoft-com:vml" xmlns:wp14="http://schemas.microsoft.com/office/word/2010/wordprocessingDrawing" xmlns:wp="http://schemas.openxmlformats.org/drawingml/2006/wordprocessingDrawing" xmlns:w10="urn:schemas-microsoft-com:office:word" xmlns:w="http://schemas.openxmlformats.org/wordprocessingml/2006/main" xmlns:w14="http://schemas.microsoft.com/office/word/2010/wordml" xmlns:w15="http://schemas.microsoft.com/office/word/2012/wordml" xmlns:w16cex="http://schemas.microsoft.com/office/word/2018/wordml/cex" xmlns:w16cid="http://schemas.microsoft.com/office/word/2016/wordml/cid" xmlns:w16="http://schemas.microsoft.com/office/word/2018/wordml" xmlns:w16sdtdh="http://schemas.microsoft.com/office/word/2020/wordml/sdtdatahash" xmlns:w16se="http://schemas.microsoft.com/office/word/2015/wordml/symex" xmlns:wpg="http://schemas.microsoft.com/office/word/2010/wordprocessingGroup" xmlns:wpi="http://schemas.microsoft.com/office/word/2010/wordprocessingInk" xmlns:wne="http://schemas.microsoft.com/office/word/2006/wordml" xmlns:wps="http://schemas.microsoft.com/office/word/2010/wordprocessingShape" mc:Ignorable="w14 w15 w16se w16cid w16 w16cex w16sdtdh wp14">
   <w:body>
     <w:p>
       <w:pPr>
@@ -59,7 +59,7 @@
           <w:iCs/>
           <w:noProof/>
         </w:rPr>
-        <w:t>November 26, 2024</w:t>
+        <w:t>November 27, 2024</w:t>
       </w:r>
       <w:r>
         <w:rPr>
@@ -314,7 +314,7 @@
           <w:highlight w:val="yellow"/>
           <w:u w:val="single"/>
         </w:rPr>
-        <w:t>DECEMBER 26, 2024</w:t>
+        <w:t>DECEMBER 27, 2024</w:t>
       </w:r>
     </w:p>
     <w:p>
@@ -744,7 +744,7 @@
           <w:iCs/>
           <w:highlight w:val="yellow"/>
         </w:rPr>
-        <w:t>John Mosqueda Sr And John Mosqueda Jr</w:t>
+        <w:t>John Mosqueda Sr and John Mosqueda Jr</w:t>
       </w:r>
       <w:r>
         <w:rPr>
@@ -769,25 +769,7 @@
           <w:bCs/>
           <w:iCs/>
         </w:rPr>
-        <w:t xml:space="preserve">, with your insured.  We forward this information </w:t>
-      </w:r>
-      <w:proofErr w:type="gramStart"/>
-      <w:r>
-        <w:rPr>
-          <w:rFonts w:ascii="Times New Roman" w:hAnsi="Times New Roman" w:cs="Times New Roman"/>
-          <w:bCs/>
-          <w:iCs/>
-        </w:rPr>
-        <w:t>in an attempt to</w:t>
-      </w:r>
-      <w:proofErr w:type="gramEnd"/>
-      <w:r>
-        <w:rPr>
-          <w:rFonts w:ascii="Times New Roman" w:hAnsi="Times New Roman" w:cs="Times New Roman"/>
-          <w:bCs/>
-          <w:iCs/>
-        </w:rPr>
-        <w:t xml:space="preserve"> settle the matter without need for litigation.  Accordingly, the information furnished is protected from disclosure pursuant to </w:t>
+        <w:t xml:space="preserve">, with your insured.  We forward this information in an attempt to settle the matter without need for litigation.  Accordingly, the information furnished is protected from disclosure pursuant to </w:t>
       </w:r>
       <w:r>
         <w:rPr>
@@ -846,25 +828,7 @@
           <w:bCs/>
           <w:iCs/>
         </w:rPr>
-        <w:t xml:space="preserve"> sustained. These documents are submitted as </w:t>
-      </w:r>
-      <w:proofErr w:type="gramStart"/>
-      <w:r>
-        <w:rPr>
-          <w:rFonts w:ascii="Times New Roman" w:hAnsi="Times New Roman" w:cs="Times New Roman"/>
-          <w:bCs/>
-          <w:iCs/>
-        </w:rPr>
-        <w:t>follow</w:t>
-      </w:r>
-      <w:proofErr w:type="gramEnd"/>
-      <w:r>
-        <w:rPr>
-          <w:rFonts w:ascii="Times New Roman" w:hAnsi="Times New Roman" w:cs="Times New Roman"/>
-          <w:bCs/>
-          <w:iCs/>
-        </w:rPr>
-        <w:t>:</w:t>
+        <w:t xml:space="preserve"> sustained. These documents are submitted as follow:</w:t>
       </w:r>
     </w:p>
     <w:bookmarkEnd w:id="0"/>
@@ -1133,13 +1097,23 @@
         </w:rPr>
         <w:tab/>
       </w:r>
-      <w:r>
-        <w:rPr>
-          <w:rFonts w:ascii="Times New Roman" w:hAnsi="Times New Roman" w:cs="Times New Roman"/>
-          <w:b/>
-          <w:highlight w:val="yellow"/>
-        </w:rPr>
-        <w:t xml:space="preserve">Synergex Med. Inc. </w:t>
+      <w:proofErr w:type="spellStart"/>
+      <w:r>
+        <w:rPr>
+          <w:rFonts w:ascii="Times New Roman" w:hAnsi="Times New Roman" w:cs="Times New Roman"/>
+          <w:b/>
+          <w:highlight w:val="yellow"/>
+        </w:rPr>
+        <w:t>Synergex</w:t>
+      </w:r>
+      <w:proofErr w:type="spellEnd"/>
+      <w:r>
+        <w:rPr>
+          <w:rFonts w:ascii="Times New Roman" w:hAnsi="Times New Roman" w:cs="Times New Roman"/>
+          <w:b/>
+          <w:highlight w:val="yellow"/>
+        </w:rPr>
+        <w:t xml:space="preserve"> Med. Inc. </w:t>
       </w:r>
       <w:r>
         <w:rPr>
@@ -2975,7 +2949,7 @@
           <w:rFonts w:ascii="Times New Roman" w:eastAsia="Calibri" w:hAnsi="Times New Roman" w:cs="Times New Roman"/>
           <w:highlight w:val="yellow"/>
         </w:rPr>
-        <w:t>Mr. Mosqueda Jr</w:t>
+        <w:t>Mr. Mosqueda Sr and Mrs. Mosqueda Jr</w:t>
       </w:r>
       <w:r>
         <w:rPr>
@@ -3024,27 +2998,14 @@
         <w:rPr>
           <w:rFonts w:ascii="Times New Roman" w:eastAsia="Calibri" w:hAnsi="Times New Roman" w:cs="Times New Roman"/>
         </w:rPr>
-        <w:t xml:space="preserve">will </w:t>
-      </w:r>
-      <w:proofErr w:type="gramStart"/>
-      <w:r>
-        <w:rPr>
-          <w:rFonts w:ascii="Times New Roman" w:eastAsia="Calibri" w:hAnsi="Times New Roman" w:cs="Times New Roman"/>
-        </w:rPr>
-        <w:t>require to have</w:t>
-      </w:r>
-      <w:proofErr w:type="gramEnd"/>
-      <w:r>
-        <w:rPr>
-          <w:rFonts w:ascii="Times New Roman" w:eastAsia="Calibri" w:hAnsi="Times New Roman" w:cs="Times New Roman"/>
-        </w:rPr>
-        <w:t xml:space="preserve"> the availability of further medical care immediately available to hi</w:t>
-      </w:r>
-      <w:r>
-        <w:rPr>
-          <w:rFonts w:ascii="Times New Roman" w:eastAsia="Calibri" w:hAnsi="Times New Roman" w:cs="Times New Roman"/>
-        </w:rPr>
-        <w:t>m</w:t>
+        <w:t xml:space="preserve">will require to have the availability of further medical care immediately available to </w:t>
+      </w:r>
+      <w:r>
+        <w:rPr>
+          <w:rFonts w:ascii="Times New Roman" w:eastAsia="Calibri" w:hAnsi="Times New Roman" w:cs="Times New Roman"/>
+          <w:highlight w:val="yellow"/>
+        </w:rPr>
+        <w:t>them</w:t>
       </w:r>
       <w:r>
         <w:rPr>
@@ -3126,7 +3087,7 @@
           <w:rFonts w:ascii="Times New Roman" w:eastAsia="Calibri" w:hAnsi="Times New Roman" w:cs="Times New Roman"/>
           <w:highlight w:val="yellow"/>
         </w:rPr>
-        <w:t>Mr. Mosqueda Jr</w:t>
+        <w:t>Mr. Mosqueda Sr and Mrs. Mosqueda Jr</w:t>
       </w:r>
       <w:r>
         <w:rPr>
@@ -3138,21 +3099,7 @@
         <w:rPr>
           <w:rFonts w:ascii="Times New Roman" w:eastAsia="Calibri" w:hAnsi="Times New Roman" w:cs="Times New Roman"/>
         </w:rPr>
-        <w:t xml:space="preserve">will most likely require a series of epidural steroid injections. These injections are usually performed at a surgical center facility in a series of three and can cost between $10,000.00 and $17,000.00 each per injection. This fee typically includes </w:t>
-      </w:r>
-      <w:proofErr w:type="gramStart"/>
-      <w:r>
-        <w:rPr>
-          <w:rFonts w:ascii="Times New Roman" w:eastAsia="Calibri" w:hAnsi="Times New Roman" w:cs="Times New Roman"/>
-        </w:rPr>
-        <w:t>the surgeon</w:t>
-      </w:r>
-      <w:proofErr w:type="gramEnd"/>
-      <w:r>
-        <w:rPr>
-          <w:rFonts w:ascii="Times New Roman" w:eastAsia="Calibri" w:hAnsi="Times New Roman" w:cs="Times New Roman"/>
-        </w:rPr>
-        <w:t>, medication, anesthesiology, outpatient surgical center fees, fluoroscopic guidance etc.</w:t>
+        <w:t>will most likely require a series of epidural steroid injections. These injections are usually performed at a surgical center facility in a series of three and can cost between $10,000.00 and $17,000.00 each per injection. This fee typically includes the surgeon, medication, anesthesiology, outpatient surgical center fees, fluoroscopic guidance etc.</w:t>
       </w:r>
     </w:p>
     <w:p>
@@ -3245,7 +3192,7 @@
           <w:highlight w:val="yellow"/>
           <w:shd w:val="clear" w:color="auto" w:fill="FCFCFD"/>
         </w:rPr>
-        <w:t>he</w:t>
+        <w:t>she</w:t>
       </w:r>
       <w:r>
         <w:rPr>
@@ -3318,7 +3265,7 @@
           <w:highlight w:val="yellow"/>
           <w:shd w:val="clear" w:color="auto" w:fill="FCFCFD"/>
         </w:rPr>
-        <w:t>John Mosqueda Sr And John Mosqueda Jr</w:t>
+        <w:t>John Mosqueda Sr and John Mosqueda Jr</w:t>
       </w:r>
       <w:r>
         <w:rPr>
@@ -3354,34 +3301,16 @@
           <w:b/>
           <w:shd w:val="clear" w:color="auto" w:fill="FCFCFD"/>
         </w:rPr>
-        <w:t xml:space="preserve">Nevertheless, should this matter proceed </w:t>
-      </w:r>
-      <w:proofErr w:type="gramStart"/>
-      <w:r>
-        <w:rPr>
-          <w:rFonts w:ascii="Times New Roman" w:eastAsia="Calibri" w:hAnsi="Times New Roman" w:cs="Times New Roman"/>
-          <w:b/>
+        <w:t xml:space="preserve">Nevertheless, should this matter proceed to litigation and trial, based on the foregoing, including the testimony from expert witnesses, a reasonable estimate of </w:t>
+      </w:r>
+      <w:r>
+        <w:rPr>
+          <w:rFonts w:ascii="Times New Roman" w:eastAsia="Calibri" w:hAnsi="Times New Roman" w:cs="Times New Roman"/>
+          <w:b/>
+          <w:highlight w:val="yellow"/>
           <w:shd w:val="clear" w:color="auto" w:fill="FCFCFD"/>
         </w:rPr>
-        <w:t>to</w:t>
-      </w:r>
-      <w:proofErr w:type="gramEnd"/>
-      <w:r>
-        <w:rPr>
-          <w:rFonts w:ascii="Times New Roman" w:eastAsia="Calibri" w:hAnsi="Times New Roman" w:cs="Times New Roman"/>
-          <w:b/>
-          <w:shd w:val="clear" w:color="auto" w:fill="FCFCFD"/>
-        </w:rPr>
-        <w:t xml:space="preserve"> litigation and trial, based on the foregoing, including the testimony from expert witnesses, a reasonable estimate of </w:t>
-      </w:r>
-      <w:r>
-        <w:rPr>
-          <w:rFonts w:ascii="Times New Roman" w:eastAsia="Calibri" w:hAnsi="Times New Roman" w:cs="Times New Roman"/>
-          <w:b/>
-          <w:highlight w:val="yellow"/>
-          <w:shd w:val="clear" w:color="auto" w:fill="FCFCFD"/>
-        </w:rPr>
-        <w:t>Mr. John Mosqueda Sr And John Mosqueda Jr</w:t>
+        <w:t>Mr. John Mosqueda Sr and Mrs. John Mosqueda Jr</w:t>
       </w:r>
       <w:r>
         <w:rPr>
@@ -3960,7 +3889,7 @@
           <w:rFonts w:ascii="Times New Roman" w:hAnsi="Times New Roman" w:cs="Times New Roman"/>
           <w:highlight w:val="yellow"/>
         </w:rPr>
-        <w:t>Mr. Mosqueda Jr</w:t>
+        <w:t>Mr. Mosqueda Sr and Mrs. Mosqueda Jr</w:t>
       </w:r>
       <w:r>
         <w:rPr>
@@ -3968,14 +3897,12 @@
         </w:rPr>
         <w:t xml:space="preserve">, as detailed above, are substantially in excess of your insured’s policy limit amount, and we believe that if the case goes to </w:t>
       </w:r>
-      <w:proofErr w:type="gramStart"/>
-      <w:r>
-        <w:rPr>
-          <w:rFonts w:ascii="Times New Roman" w:hAnsi="Times New Roman" w:cs="Times New Roman"/>
-        </w:rPr>
-        <w:t>trial</w:t>
-      </w:r>
-      <w:proofErr w:type="gramEnd"/>
+      <w:r>
+        <w:rPr>
+          <w:rFonts w:ascii="Times New Roman" w:hAnsi="Times New Roman" w:cs="Times New Roman"/>
+        </w:rPr>
+        <w:t>trial,</w:t>
+      </w:r>
       <w:r>
         <w:rPr>
           <w:rFonts w:ascii="Times New Roman" w:hAnsi="Times New Roman" w:cs="Times New Roman"/>
@@ -4036,21 +3963,7 @@
         <w:rPr>
           <w:rFonts w:ascii="Times New Roman" w:hAnsi="Times New Roman" w:cs="Times New Roman"/>
         </w:rPr>
-        <w:t xml:space="preserve">As you are </w:t>
-      </w:r>
-      <w:proofErr w:type="gramStart"/>
-      <w:r>
-        <w:rPr>
-          <w:rFonts w:ascii="Times New Roman" w:hAnsi="Times New Roman" w:cs="Times New Roman"/>
-        </w:rPr>
-        <w:t>well aware</w:t>
-      </w:r>
-      <w:proofErr w:type="gramEnd"/>
-      <w:r>
-        <w:rPr>
-          <w:rFonts w:ascii="Times New Roman" w:hAnsi="Times New Roman" w:cs="Times New Roman"/>
-        </w:rPr>
-        <w:t xml:space="preserve">, insurers such as your company owe an </w:t>
+        <w:t xml:space="preserve">As you are well aware, insurers such as your company owe an </w:t>
       </w:r>
       <w:r>
         <w:rPr>
@@ -4091,33 +4004,29 @@
         </w:rPr>
         <w:t xml:space="preserve">within policy limits when there is a substantial likelihood of a judgment in excess of those limits. </w:t>
       </w:r>
+      <w:proofErr w:type="spellStart"/>
       <w:r>
         <w:rPr>
           <w:rFonts w:ascii="Times New Roman" w:hAnsi="Times New Roman" w:cs="Times New Roman"/>
           <w:i/>
           <w:iCs/>
         </w:rPr>
-        <w:t xml:space="preserve">Crisci </w:t>
-      </w:r>
-      <w:r>
-        <w:rPr>
-          <w:rFonts w:ascii="Times New Roman" w:hAnsi="Times New Roman" w:cs="Times New Roman"/>
-        </w:rPr>
-        <w:t xml:space="preserve">v. </w:t>
-      </w:r>
+        <w:t>Crisci</w:t>
+      </w:r>
+      <w:proofErr w:type="spellEnd"/>
       <w:r>
         <w:rPr>
           <w:rFonts w:ascii="Times New Roman" w:hAnsi="Times New Roman" w:cs="Times New Roman"/>
           <w:i/>
           <w:iCs/>
         </w:rPr>
-        <w:t xml:space="preserve">Security Insurance Company </w:t>
-      </w:r>
-      <w:r>
-        <w:rPr>
-          <w:rFonts w:ascii="Times New Roman" w:hAnsi="Times New Roman" w:cs="Times New Roman"/>
-        </w:rPr>
-        <w:t xml:space="preserve">(1967) 66 Cal.2d 425; </w:t>
+        <w:t xml:space="preserve"> </w:t>
+      </w:r>
+      <w:r>
+        <w:rPr>
+          <w:rFonts w:ascii="Times New Roman" w:hAnsi="Times New Roman" w:cs="Times New Roman"/>
+        </w:rPr>
+        <w:t xml:space="preserve">v. </w:t>
       </w:r>
       <w:r>
         <w:rPr>
@@ -4125,13 +4034,13 @@
           <w:i/>
           <w:iCs/>
         </w:rPr>
-        <w:t xml:space="preserve">Garner </w:t>
-      </w:r>
-      <w:r>
-        <w:rPr>
-          <w:rFonts w:ascii="Times New Roman" w:hAnsi="Times New Roman" w:cs="Times New Roman"/>
-        </w:rPr>
-        <w:t xml:space="preserve">v. </w:t>
+        <w:t xml:space="preserve">Security Insurance Company </w:t>
+      </w:r>
+      <w:r>
+        <w:rPr>
+          <w:rFonts w:ascii="Times New Roman" w:hAnsi="Times New Roman" w:cs="Times New Roman"/>
+        </w:rPr>
+        <w:t xml:space="preserve">(1967) 66 Cal.2d 425; </w:t>
       </w:r>
       <w:r>
         <w:rPr>
@@ -4139,13 +4048,13 @@
           <w:i/>
           <w:iCs/>
         </w:rPr>
-        <w:t xml:space="preserve">American Mutual Liability Insurance Company </w:t>
-      </w:r>
-      <w:r>
-        <w:rPr>
-          <w:rFonts w:ascii="Times New Roman" w:hAnsi="Times New Roman" w:cs="Times New Roman"/>
-        </w:rPr>
-        <w:t xml:space="preserve">(1973) 31 Cal. App.3d 843,847-848 [as to the “crucial issue” of a liability insurer's duty to accept reasonable settlement offers within policy limits, the duty to consider and weigh all of the facts bearing upon the advisability of a settlement in the interest of the insured </w:t>
+        <w:t xml:space="preserve">Garner </w:t>
+      </w:r>
+      <w:r>
+        <w:rPr>
+          <w:rFonts w:ascii="Times New Roman" w:hAnsi="Times New Roman" w:cs="Times New Roman"/>
+        </w:rPr>
+        <w:t xml:space="preserve">v. </w:t>
       </w:r>
       <w:r>
         <w:rPr>
@@ -4153,13 +4062,13 @@
           <w:i/>
           <w:iCs/>
         </w:rPr>
-        <w:t xml:space="preserve">is upon the insurance carrier </w:t>
-      </w:r>
-      <w:r>
-        <w:rPr>
-          <w:rFonts w:ascii="Times New Roman" w:hAnsi="Times New Roman" w:cs="Times New Roman"/>
-        </w:rPr>
-        <w:t xml:space="preserve">as well as the duty to “consider, </w:t>
+        <w:t xml:space="preserve">American Mutual Liability Insurance Company </w:t>
+      </w:r>
+      <w:r>
+        <w:rPr>
+          <w:rFonts w:ascii="Times New Roman" w:hAnsi="Times New Roman" w:cs="Times New Roman"/>
+        </w:rPr>
+        <w:t xml:space="preserve">(1973) 31 Cal. App.3d 843,847-848 [as to the “crucial issue” of a liability insurer's duty to accept reasonable settlement offers within policy limits, the duty to consider and weigh all of the facts bearing upon the advisability of a settlement in the interest of the insured </w:t>
       </w:r>
       <w:r>
         <w:rPr>
@@ -4167,43 +4076,13 @@
           <w:i/>
           <w:iCs/>
         </w:rPr>
-        <w:t>accept</w:t>
-      </w:r>
-      <w:r>
-        <w:rPr>
-          <w:rFonts w:ascii="Times New Roman" w:hAnsi="Times New Roman" w:cs="Times New Roman"/>
-        </w:rPr>
-        <w:t xml:space="preserve"> or make a reasonable settlement offer” (emphasis added)]. </w:t>
-      </w:r>
-    </w:p>
-    <w:p>
-      <w:pPr>
-        <w:tabs>
-          <w:tab w:val="left" w:pos="540"/>
-        </w:tabs>
-        <w:ind w:left="547"/>
-        <w:jc w:val="both"/>
-        <w:rPr>
-          <w:rFonts w:ascii="Times New Roman" w:hAnsi="Times New Roman" w:cs="Times New Roman"/>
-        </w:rPr>
-      </w:pPr>
-    </w:p>
-    <w:p>
-      <w:pPr>
-        <w:tabs>
-          <w:tab w:val="left" w:pos="540"/>
-        </w:tabs>
-        <w:ind w:left="547"/>
-        <w:jc w:val="both"/>
-        <w:rPr>
-          <w:rFonts w:ascii="Times New Roman" w:hAnsi="Times New Roman" w:cs="Times New Roman"/>
-        </w:rPr>
-      </w:pPr>
-      <w:r>
-        <w:rPr>
-          <w:rFonts w:ascii="Times New Roman" w:hAnsi="Times New Roman" w:cs="Times New Roman"/>
-        </w:rPr>
-        <w:t xml:space="preserve">Moreover, the implied covenant imposes upon the insurer the duty to communicate the results of any </w:t>
+        <w:t xml:space="preserve">is upon the insurance carrier </w:t>
+      </w:r>
+      <w:r>
+        <w:rPr>
+          <w:rFonts w:ascii="Times New Roman" w:hAnsi="Times New Roman" w:cs="Times New Roman"/>
+        </w:rPr>
+        <w:t xml:space="preserve">as well as the duty to “consider, </w:t>
       </w:r>
       <w:r>
         <w:rPr>
@@ -4211,27 +4090,43 @@
           <w:i/>
           <w:iCs/>
         </w:rPr>
-        <w:t xml:space="preserve">investigation </w:t>
-      </w:r>
-      <w:r>
-        <w:rPr>
-          <w:rFonts w:ascii="Times New Roman" w:hAnsi="Times New Roman" w:cs="Times New Roman"/>
-        </w:rPr>
-        <w:t xml:space="preserve">indicating liability </w:t>
-      </w:r>
-      <w:proofErr w:type="gramStart"/>
-      <w:r>
-        <w:rPr>
-          <w:rFonts w:ascii="Times New Roman" w:hAnsi="Times New Roman" w:cs="Times New Roman"/>
-        </w:rPr>
-        <w:t>in excess of</w:t>
-      </w:r>
-      <w:proofErr w:type="gramEnd"/>
-      <w:r>
-        <w:rPr>
-          <w:rFonts w:ascii="Times New Roman" w:hAnsi="Times New Roman" w:cs="Times New Roman"/>
-        </w:rPr>
-        <w:t xml:space="preserve"> policy limits to the insured, </w:t>
+        <w:t>accept</w:t>
+      </w:r>
+      <w:r>
+        <w:rPr>
+          <w:rFonts w:ascii="Times New Roman" w:hAnsi="Times New Roman" w:cs="Times New Roman"/>
+        </w:rPr>
+        <w:t xml:space="preserve"> or make a reasonable settlement offer” (emphasis added)]. </w:t>
+      </w:r>
+    </w:p>
+    <w:p>
+      <w:pPr>
+        <w:tabs>
+          <w:tab w:val="left" w:pos="540"/>
+        </w:tabs>
+        <w:ind w:left="547"/>
+        <w:jc w:val="both"/>
+        <w:rPr>
+          <w:rFonts w:ascii="Times New Roman" w:hAnsi="Times New Roman" w:cs="Times New Roman"/>
+        </w:rPr>
+      </w:pPr>
+    </w:p>
+    <w:p>
+      <w:pPr>
+        <w:tabs>
+          <w:tab w:val="left" w:pos="540"/>
+        </w:tabs>
+        <w:ind w:left="547"/>
+        <w:jc w:val="both"/>
+        <w:rPr>
+          <w:rFonts w:ascii="Times New Roman" w:hAnsi="Times New Roman" w:cs="Times New Roman"/>
+        </w:rPr>
+      </w:pPr>
+      <w:r>
+        <w:rPr>
+          <w:rFonts w:ascii="Times New Roman" w:hAnsi="Times New Roman" w:cs="Times New Roman"/>
+        </w:rPr>
+        <w:t xml:space="preserve">Moreover, the implied covenant imposes upon the insurer the duty to communicate the results of any </w:t>
       </w:r>
       <w:r>
         <w:rPr>
@@ -4239,13 +4134,13 @@
           <w:i/>
           <w:iCs/>
         </w:rPr>
-        <w:t xml:space="preserve">Davy </w:t>
-      </w:r>
-      <w:r>
-        <w:rPr>
-          <w:rFonts w:ascii="Times New Roman" w:hAnsi="Times New Roman" w:cs="Times New Roman"/>
-        </w:rPr>
-        <w:t xml:space="preserve">v. </w:t>
+        <w:t xml:space="preserve">investigation </w:t>
+      </w:r>
+      <w:r>
+        <w:rPr>
+          <w:rFonts w:ascii="Times New Roman" w:hAnsi="Times New Roman" w:cs="Times New Roman"/>
+        </w:rPr>
+        <w:t xml:space="preserve">indicating liability in excess of policy limits to the insured, </w:t>
       </w:r>
       <w:r>
         <w:rPr>
@@ -4253,29 +4148,27 @@
           <w:i/>
           <w:iCs/>
         </w:rPr>
-        <w:t xml:space="preserve">Public National Insurance Company </w:t>
-      </w:r>
-      <w:r>
-        <w:rPr>
-          <w:rFonts w:ascii="Times New Roman" w:hAnsi="Times New Roman" w:cs="Times New Roman"/>
-        </w:rPr>
-        <w:t xml:space="preserve">(1960) 181 Cal. App.2d 387, 396, as well as the duty to inform its insured of </w:t>
-      </w:r>
-      <w:r>
-        <w:rPr>
-          <w:rFonts w:ascii="Times New Roman" w:hAnsi="Times New Roman" w:cs="Times New Roman"/>
-          <w:b/>
+        <w:t xml:space="preserve">Davy </w:t>
+      </w:r>
+      <w:r>
+        <w:rPr>
+          <w:rFonts w:ascii="Times New Roman" w:hAnsi="Times New Roman" w:cs="Times New Roman"/>
+        </w:rPr>
+        <w:t xml:space="preserve">v. </w:t>
+      </w:r>
+      <w:r>
+        <w:rPr>
+          <w:rFonts w:ascii="Times New Roman" w:hAnsi="Times New Roman" w:cs="Times New Roman"/>
           <w:i/>
           <w:iCs/>
         </w:rPr>
-        <w:t>all consequences, particularly</w:t>
-      </w:r>
-      <w:r>
-        <w:rPr>
-          <w:rFonts w:ascii="Times New Roman" w:hAnsi="Times New Roman" w:cs="Times New Roman"/>
-          <w:b/>
-        </w:rPr>
-        <w:t xml:space="preserve"> </w:t>
+        <w:t xml:space="preserve">Public National Insurance Company </w:t>
+      </w:r>
+      <w:r>
+        <w:rPr>
+          <w:rFonts w:ascii="Times New Roman" w:hAnsi="Times New Roman" w:cs="Times New Roman"/>
+        </w:rPr>
+        <w:t xml:space="preserve">(1960) 181 Cal. App.2d 387, 396, as well as the duty to inform its insured of </w:t>
       </w:r>
       <w:r>
         <w:rPr>
@@ -4284,21 +4177,23 @@
           <w:i/>
           <w:iCs/>
         </w:rPr>
-        <w:t>financial consequences which could occur regarding a failure to settle within policy limits.</w:t>
-      </w:r>
-      <w:r>
-        <w:rPr>
-          <w:rFonts w:ascii="Times New Roman" w:hAnsi="Times New Roman" w:cs="Times New Roman"/>
+        <w:t>all consequences, particularly</w:t>
+      </w:r>
+      <w:r>
+        <w:rPr>
+          <w:rFonts w:ascii="Times New Roman" w:hAnsi="Times New Roman" w:cs="Times New Roman"/>
+          <w:b/>
+        </w:rPr>
+        <w:t xml:space="preserve"> </w:t>
+      </w:r>
+      <w:r>
+        <w:rPr>
+          <w:rFonts w:ascii="Times New Roman" w:hAnsi="Times New Roman" w:cs="Times New Roman"/>
+          <w:b/>
           <w:i/>
           <w:iCs/>
         </w:rPr>
-        <w:t xml:space="preserve"> Transit</w:t>
-      </w:r>
-      <w:r>
-        <w:rPr>
-          <w:rFonts w:ascii="Times New Roman" w:hAnsi="Times New Roman" w:cs="Times New Roman"/>
-        </w:rPr>
-        <w:t xml:space="preserve"> </w:t>
+        <w:t>financial consequences which could occur regarding a failure to settle within policy limits.</w:t>
       </w:r>
       <w:r>
         <w:rPr>
@@ -4306,13 +4201,13 @@
           <w:i/>
           <w:iCs/>
         </w:rPr>
-        <w:t xml:space="preserve">Casualty Company </w:t>
-      </w:r>
-      <w:r>
-        <w:rPr>
-          <w:rFonts w:ascii="Times New Roman" w:hAnsi="Times New Roman" w:cs="Times New Roman"/>
-        </w:rPr>
-        <w:t xml:space="preserve">v. </w:t>
+        <w:t xml:space="preserve"> Transit</w:t>
+      </w:r>
+      <w:r>
+        <w:rPr>
+          <w:rFonts w:ascii="Times New Roman" w:hAnsi="Times New Roman" w:cs="Times New Roman"/>
+        </w:rPr>
+        <w:t xml:space="preserve"> </w:t>
       </w:r>
       <w:r>
         <w:rPr>
@@ -4320,13 +4215,13 @@
           <w:i/>
           <w:iCs/>
         </w:rPr>
-        <w:t xml:space="preserve">Spink Corporation </w:t>
-      </w:r>
-      <w:r>
-        <w:rPr>
-          <w:rFonts w:ascii="Times New Roman" w:hAnsi="Times New Roman" w:cs="Times New Roman"/>
-        </w:rPr>
-        <w:t xml:space="preserve">(1979) 94 Cal.App.3d 124, 137, disapproved on other grounds in </w:t>
+        <w:t xml:space="preserve">Casualty Company </w:t>
+      </w:r>
+      <w:r>
+        <w:rPr>
+          <w:rFonts w:ascii="Times New Roman" w:hAnsi="Times New Roman" w:cs="Times New Roman"/>
+        </w:rPr>
+        <w:t xml:space="preserve">v. </w:t>
       </w:r>
       <w:r>
         <w:rPr>
@@ -4334,13 +4229,13 @@
           <w:i/>
           <w:iCs/>
         </w:rPr>
-        <w:t xml:space="preserve">Commercial Union Insurance Company </w:t>
-      </w:r>
-      <w:r>
-        <w:rPr>
-          <w:rFonts w:ascii="Times New Roman" w:hAnsi="Times New Roman" w:cs="Times New Roman"/>
-        </w:rPr>
-        <w:t xml:space="preserve">v. </w:t>
+        <w:t xml:space="preserve">Spink Corporation </w:t>
+      </w:r>
+      <w:r>
+        <w:rPr>
+          <w:rFonts w:ascii="Times New Roman" w:hAnsi="Times New Roman" w:cs="Times New Roman"/>
+        </w:rPr>
+        <w:t xml:space="preserve">(1979) 94 Cal.App.3d 124, 137, disapproved on other grounds in </w:t>
       </w:r>
       <w:r>
         <w:rPr>
@@ -4348,6 +4243,20 @@
           <w:i/>
           <w:iCs/>
         </w:rPr>
+        <w:t xml:space="preserve">Commercial Union Insurance Company </w:t>
+      </w:r>
+      <w:r>
+        <w:rPr>
+          <w:rFonts w:ascii="Times New Roman" w:hAnsi="Times New Roman" w:cs="Times New Roman"/>
+        </w:rPr>
+        <w:t xml:space="preserve">v. </w:t>
+      </w:r>
+      <w:r>
+        <w:rPr>
+          <w:rFonts w:ascii="Times New Roman" w:hAnsi="Times New Roman" w:cs="Times New Roman"/>
+          <w:i/>
+          <w:iCs/>
+        </w:rPr>
         <w:t xml:space="preserve">Safeway Stores </w:t>
       </w:r>
       <w:r>
@@ -4384,35 +4293,7 @@
         <w:rPr>
           <w:rFonts w:ascii="Times New Roman" w:hAnsi="Times New Roman" w:cs="Times New Roman"/>
         </w:rPr>
-        <w:t xml:space="preserve">Where an insurer unreasonably fails to protect </w:t>
-      </w:r>
-      <w:proofErr w:type="gramStart"/>
-      <w:r>
-        <w:rPr>
-          <w:rFonts w:ascii="Times New Roman" w:hAnsi="Times New Roman" w:cs="Times New Roman"/>
-        </w:rPr>
-        <w:t>it’s insured</w:t>
-      </w:r>
-      <w:proofErr w:type="gramEnd"/>
-      <w:r>
-        <w:rPr>
-          <w:rFonts w:ascii="Times New Roman" w:hAnsi="Times New Roman" w:cs="Times New Roman"/>
-        </w:rPr>
-        <w:t xml:space="preserve"> from a compensatory judgment </w:t>
-      </w:r>
-      <w:proofErr w:type="gramStart"/>
-      <w:r>
-        <w:rPr>
-          <w:rFonts w:ascii="Times New Roman" w:hAnsi="Times New Roman" w:cs="Times New Roman"/>
-        </w:rPr>
-        <w:t>in excess of</w:t>
-      </w:r>
-      <w:proofErr w:type="gramEnd"/>
-      <w:r>
-        <w:rPr>
-          <w:rFonts w:ascii="Times New Roman" w:hAnsi="Times New Roman" w:cs="Times New Roman"/>
-        </w:rPr>
-        <w:t xml:space="preserve"> that insured's policy limits by failing to accept an offer of settlement within policy limits, the insurer is responsible for the </w:t>
+        <w:t xml:space="preserve">Where an insurer unreasonably fails to protect it’s insured from a compensatory judgment in excess of that insured's policy limits by failing to accept an offer of settlement within policy limits, the insurer is responsible for the </w:t>
       </w:r>
       <w:r>
         <w:rPr>
@@ -4486,33 +4367,26 @@
         <w:rPr>
           <w:rFonts w:ascii="Times New Roman" w:hAnsi="Times New Roman" w:cs="Times New Roman"/>
         </w:rPr>
-        <w:t xml:space="preserve">“As we have seen, the duty of an insurer to consider the insured's interest in settlement offers within the policy limits arises from an implied covenant in the contract, and ordinarily contract duties are strictly enforced and not subject to a standard of reasonableness. Obviously, it will always be in the insured's interest to settle within the policy limits when there is any danger, however slight, of a judgment </w:t>
-      </w:r>
-      <w:proofErr w:type="gramStart"/>
-      <w:r>
-        <w:rPr>
-          <w:rFonts w:ascii="Times New Roman" w:hAnsi="Times New Roman" w:cs="Times New Roman"/>
-        </w:rPr>
-        <w:t>in excess of</w:t>
-      </w:r>
-      <w:proofErr w:type="gramEnd"/>
-      <w:r>
-        <w:rPr>
-          <w:rFonts w:ascii="Times New Roman" w:hAnsi="Times New Roman" w:cs="Times New Roman"/>
-        </w:rPr>
-        <w:t xml:space="preserve"> those limits. Accordingly the rejection of a settlement within the limits where there is any danger of a judgment in excess of the limits can be justified, if at all, only on the basis of the interests of the insurer, and, in light of the common knowledge that settlement is one of the usual methods by which an insured receives protection under a liability policy, it may not be unreasonable for an insured who purchases a policy with limits to believe that a sum of money equal to the limits is available and will be used so as to avoid liability on </w:t>
-      </w:r>
-      <w:r>
-        <w:rPr>
-          <w:rFonts w:ascii="Times New Roman" w:hAnsi="Times New Roman" w:cs="Times New Roman"/>
-        </w:rPr>
-        <w:t>his</w:t>
-      </w:r>
-      <w:r>
-        <w:rPr>
-          <w:rFonts w:ascii="Times New Roman" w:hAnsi="Times New Roman" w:cs="Times New Roman"/>
-        </w:rPr>
-        <w:t xml:space="preserve"> part with regard to any covered accident. I view of such expectation an insurer should not be permitted to further its own interests by rejecting opportunities to settle within the policy limits unless it is also willing to absorb losses which may result from its failure to settle.</w:t>
+        <w:t xml:space="preserve">“As we have seen, the duty of an insurer to consider the insured's interest in settlement offers within the policy limits arises from an implied covenant in the contract, and ordinarily contract duties are strictly enforced and not subject to a standard of reasonableness. Obviously, it will always be in the insured's interest to settle within the policy limits when there is any danger, however slight, of a judgment in excess of those limits. Accordingly the rejection of a settlement within the limits where there is any danger of a judgment in excess of the limits can be justified, if at all, only on the basis of the interests of the insurer, and, in light of the common knowledge that settlement is one of the usual methods by which an insured receives protection under a liability policy, it may not be unreasonable for an insured who purchases a policy with limits to believe that a sum of money equal to the limits is available and will be used so as to avoid liability on </w:t>
+      </w:r>
+      <w:r>
+        <w:rPr>
+          <w:rFonts w:ascii="Times New Roman" w:hAnsi="Times New Roman" w:cs="Times New Roman"/>
+          <w:highlight w:val="yellow"/>
+        </w:rPr>
+        <w:t>her</w:t>
+      </w:r>
+      <w:r>
+        <w:rPr>
+          <w:rFonts w:ascii="Times New Roman" w:hAnsi="Times New Roman" w:cs="Times New Roman"/>
+        </w:rPr>
+        <w:t xml:space="preserve"> </w:t>
+      </w:r>
+      <w:r>
+        <w:rPr>
+          <w:rFonts w:ascii="Times New Roman" w:hAnsi="Times New Roman" w:cs="Times New Roman"/>
+        </w:rPr>
+        <w:t>part with regard to any covered accident. I view of such expectation an insurer should not be permitted to further its own interests by rejecting opportunities to settle within the policy limits unless it is also willing to absorb losses which may result from its failure to settle.</w:t>
       </w:r>
     </w:p>
     <w:p>
@@ -4572,76 +4446,101 @@
         <w:rPr>
           <w:rFonts w:ascii="Times New Roman" w:hAnsi="Times New Roman" w:cs="Times New Roman"/>
         </w:rPr>
-        <w:lastRenderedPageBreak/>
         <w:t xml:space="preserve">Finally, and most importantly, there is more than a small amount of elementary justice in a rule that would require that, in this situation where the insurer's and insured's interests necessarily conflict, the insurer, which may reap the benefits of its determination not to settle, should also suffer the detriments of its decision.” </w:t>
       </w:r>
+      <w:proofErr w:type="spellStart"/>
       <w:r>
         <w:rPr>
           <w:rFonts w:ascii="Times New Roman" w:hAnsi="Times New Roman" w:cs="Times New Roman"/>
           <w:i/>
           <w:iCs/>
         </w:rPr>
-        <w:t xml:space="preserve">Crisci, </w:t>
-      </w:r>
-      <w:r>
-        <w:rPr>
-          <w:rFonts w:ascii="Times New Roman" w:hAnsi="Times New Roman" w:cs="Times New Roman"/>
-        </w:rPr>
-        <w:t>supra, 66 Ca1.2d at 430-431.</w:t>
-      </w:r>
-    </w:p>
-    <w:p>
-      <w:pPr>
-        <w:tabs>
-          <w:tab w:val="left" w:pos="1440"/>
-        </w:tabs>
-        <w:ind w:left="1440"/>
-        <w:jc w:val="both"/>
+        <w:t>Crisci</w:t>
+      </w:r>
+      <w:proofErr w:type="spellEnd"/>
+      <w:r>
         <w:rPr>
           <w:rFonts w:ascii="Times New Roman" w:hAnsi="Times New Roman" w:cs="Times New Roman"/>
           <w:i/>
           <w:iCs/>
         </w:rPr>
-      </w:pPr>
-    </w:p>
-    <w:p>
-      <w:pPr>
-        <w:tabs>
-          <w:tab w:val="left" w:pos="540"/>
-        </w:tabs>
-        <w:ind w:left="547"/>
-        <w:jc w:val="both"/>
-        <w:rPr>
-          <w:rFonts w:ascii="Times New Roman" w:hAnsi="Times New Roman" w:cs="Times New Roman"/>
-        </w:rPr>
-      </w:pPr>
-      <w:r>
+        <w:t xml:space="preserve">, </w:t>
+      </w:r>
+      <w:r>
+        <w:rPr>
+          <w:rFonts w:ascii="Times New Roman" w:hAnsi="Times New Roman" w:cs="Times New Roman"/>
+        </w:rPr>
+        <w:t>supra, 66 Ca1.2d at 430-431.</w:t>
+      </w:r>
+    </w:p>
+    <w:p>
+      <w:pPr>
+        <w:tabs>
+          <w:tab w:val="left" w:pos="1440"/>
+        </w:tabs>
+        <w:ind w:left="1440"/>
+        <w:jc w:val="both"/>
         <w:rPr>
           <w:rFonts w:ascii="Times New Roman" w:hAnsi="Times New Roman" w:cs="Times New Roman"/>
           <w:i/>
           <w:iCs/>
         </w:rPr>
-        <w:t xml:space="preserve">Accord: Coe </w:t>
-      </w:r>
-      <w:r>
-        <w:rPr>
-          <w:rFonts w:ascii="Times New Roman" w:hAnsi="Times New Roman" w:cs="Times New Roman"/>
-        </w:rPr>
-        <w:t xml:space="preserve">v. </w:t>
-      </w:r>
+      </w:pPr>
+    </w:p>
+    <w:p>
+      <w:pPr>
+        <w:tabs>
+          <w:tab w:val="left" w:pos="540"/>
+        </w:tabs>
+        <w:ind w:left="547"/>
+        <w:jc w:val="both"/>
+        <w:rPr>
+          <w:rFonts w:ascii="Times New Roman" w:hAnsi="Times New Roman" w:cs="Times New Roman"/>
+        </w:rPr>
+      </w:pPr>
       <w:r>
         <w:rPr>
           <w:rFonts w:ascii="Times New Roman" w:hAnsi="Times New Roman" w:cs="Times New Roman"/>
           <w:i/>
           <w:iCs/>
         </w:rPr>
-        <w:t>Farmers Insurance Exchange</w:t>
-      </w:r>
-      <w:r>
-        <w:rPr>
-          <w:rFonts w:ascii="Times New Roman" w:hAnsi="Times New Roman" w:cs="Times New Roman"/>
-        </w:rPr>
-        <w:t xml:space="preserve">(1977) 66 Ca1.3d 981 </w:t>
+        <w:t xml:space="preserve">Accord: Coe </w:t>
+      </w:r>
+      <w:r>
+        <w:rPr>
+          <w:rFonts w:ascii="Times New Roman" w:hAnsi="Times New Roman" w:cs="Times New Roman"/>
+        </w:rPr>
+        <w:t xml:space="preserve">v. </w:t>
+      </w:r>
+      <w:r>
+        <w:rPr>
+          <w:rFonts w:ascii="Times New Roman" w:hAnsi="Times New Roman" w:cs="Times New Roman"/>
+          <w:i/>
+          <w:iCs/>
+        </w:rPr>
+        <w:t xml:space="preserve">Farmers Insurance </w:t>
+      </w:r>
+      <w:proofErr w:type="gramStart"/>
+      <w:r>
+        <w:rPr>
+          <w:rFonts w:ascii="Times New Roman" w:hAnsi="Times New Roman" w:cs="Times New Roman"/>
+          <w:i/>
+          <w:iCs/>
+        </w:rPr>
+        <w:t>Exchange</w:t>
+      </w:r>
+      <w:r>
+        <w:rPr>
+          <w:rFonts w:ascii="Times New Roman" w:hAnsi="Times New Roman" w:cs="Times New Roman"/>
+        </w:rPr>
+        <w:t>(</w:t>
+      </w:r>
+      <w:proofErr w:type="gramEnd"/>
+      <w:r>
+        <w:rPr>
+          <w:rFonts w:ascii="Times New Roman" w:hAnsi="Times New Roman" w:cs="Times New Roman"/>
+        </w:rPr>
+        <w:t xml:space="preserve">1977) 66 Ca1.3d 981 </w:t>
       </w:r>
       <w:r>
         <w:rPr>
@@ -4698,21 +4597,7 @@
         <w:rPr>
           <w:rFonts w:ascii="Times New Roman" w:hAnsi="Times New Roman" w:cs="Times New Roman"/>
         </w:rPr>
-        <w:t xml:space="preserve">The previously referred to and enclosed attachments to this letter provide you with sufficient documentation to reasonably evaluate this claim. It is evident that your </w:t>
-      </w:r>
-      <w:proofErr w:type="gramStart"/>
-      <w:r>
-        <w:rPr>
-          <w:rFonts w:ascii="Times New Roman" w:hAnsi="Times New Roman" w:cs="Times New Roman"/>
-        </w:rPr>
-        <w:t>insured</w:t>
-      </w:r>
-      <w:proofErr w:type="gramEnd"/>
-      <w:r>
-        <w:rPr>
-          <w:rFonts w:ascii="Times New Roman" w:hAnsi="Times New Roman" w:cs="Times New Roman"/>
-        </w:rPr>
-        <w:t xml:space="preserve"> is civilly culpable for my client’s significant damages, of whatever nature, and your insured’s policy must be used to compensate my client’s losses.  </w:t>
+        <w:t xml:space="preserve">The previously referred to and enclosed attachments to this letter provide you with sufficient documentation to reasonably evaluate this claim. It is evident that your insured is civilly culpable for my client’s significant damages, of whatever nature, and your insured’s policy must be used to compensate my client’s losses.  </w:t>
       </w:r>
     </w:p>
     <w:p>
@@ -4749,7 +4634,7 @@
           <w:rFonts w:ascii="Times New Roman" w:hAnsi="Times New Roman" w:cs="Times New Roman"/>
           <w:highlight w:val="yellow"/>
         </w:rPr>
-        <w:t>Mr. Mosqueda Jr</w:t>
+        <w:t>Mr. Mosqueda Sr and Mrs. Mosqueda Jr</w:t>
       </w:r>
       <w:r>
         <w:rPr>
@@ -4774,33 +4659,26 @@
         <w:rPr>
           <w:rFonts w:ascii="Times New Roman" w:hAnsi="Times New Roman" w:cs="Times New Roman"/>
         </w:rPr>
-        <w:t xml:space="preserve"> would make an extremely sympathetic </w:t>
-      </w:r>
-      <w:proofErr w:type="gramStart"/>
-      <w:r>
-        <w:rPr>
-          <w:rFonts w:ascii="Times New Roman" w:hAnsi="Times New Roman" w:cs="Times New Roman"/>
-        </w:rPr>
-        <w:t>witness</w:t>
-      </w:r>
-      <w:proofErr w:type="gramEnd"/>
-      <w:r>
-        <w:rPr>
-          <w:rFonts w:ascii="Times New Roman" w:hAnsi="Times New Roman" w:cs="Times New Roman"/>
-        </w:rPr>
-        <w:t xml:space="preserve"> and </w:t>
-      </w:r>
-      <w:r>
-        <w:rPr>
-          <w:rFonts w:ascii="Times New Roman" w:hAnsi="Times New Roman" w:cs="Times New Roman"/>
-        </w:rPr>
-        <w:t>his</w:t>
-      </w:r>
-      <w:r>
-        <w:rPr>
-          <w:rFonts w:ascii="Times New Roman" w:hAnsi="Times New Roman" w:cs="Times New Roman"/>
-        </w:rPr>
-        <w:t xml:space="preserve"> story can easily be expected to move a jury to return a significant award.  </w:t>
+        <w:t xml:space="preserve"> would make an extremely sympathetic witness and </w:t>
+      </w:r>
+      <w:r>
+        <w:rPr>
+          <w:rFonts w:ascii="Times New Roman" w:hAnsi="Times New Roman" w:cs="Times New Roman"/>
+          <w:highlight w:val="yellow"/>
+        </w:rPr>
+        <w:t>their</w:t>
+      </w:r>
+      <w:r>
+        <w:rPr>
+          <w:rFonts w:ascii="Times New Roman" w:hAnsi="Times New Roman" w:cs="Times New Roman"/>
+        </w:rPr>
+        <w:t xml:space="preserve"> </w:t>
+      </w:r>
+      <w:r>
+        <w:rPr>
+          <w:rFonts w:ascii="Times New Roman" w:hAnsi="Times New Roman" w:cs="Times New Roman"/>
+        </w:rPr>
+        <w:t xml:space="preserve">story can easily be expected to move a jury to return a significant award.  </w:t>
       </w:r>
     </w:p>
     <w:p>
@@ -4836,22 +4714,21 @@
           <w:rFonts w:ascii="Times New Roman" w:hAnsi="Times New Roman" w:cs="Times New Roman"/>
           <w:highlight w:val="yellow"/>
         </w:rPr>
-        <w:t>Mr. Mosqueda Jr</w:t>
-      </w:r>
-      <w:r>
-        <w:rPr>
-          <w:rFonts w:ascii="Times New Roman" w:hAnsi="Times New Roman" w:cs="Times New Roman"/>
-        </w:rPr>
-        <w:t xml:space="preserve"> experienced </w:t>
-      </w:r>
-      <w:proofErr w:type="gramStart"/>
-      <w:r>
-        <w:rPr>
-          <w:rFonts w:ascii="Times New Roman" w:hAnsi="Times New Roman" w:cs="Times New Roman"/>
-        </w:rPr>
-        <w:t>as a result of</w:t>
-      </w:r>
-      <w:proofErr w:type="gramEnd"/>
+        <w:t>Mr. Mosqueda Sr and Mrs. Mosqueda Jr</w:t>
+      </w:r>
+      <w:r>
+        <w:rPr>
+          <w:rFonts w:ascii="Times New Roman" w:hAnsi="Times New Roman" w:cs="Times New Roman"/>
+        </w:rPr>
+        <w:t xml:space="preserve"> experienced as a result of </w:t>
+      </w:r>
+      <w:r>
+        <w:rPr>
+          <w:rFonts w:ascii="Times New Roman" w:hAnsi="Times New Roman" w:cs="Times New Roman"/>
+          <w:highlight w:val="yellow"/>
+        </w:rPr>
+        <w:t>their</w:t>
+      </w:r>
       <w:r>
         <w:rPr>
           <w:rFonts w:ascii="Times New Roman" w:hAnsi="Times New Roman" w:cs="Times New Roman"/>
@@ -4862,13 +4739,7 @@
         <w:rPr>
           <w:rFonts w:ascii="Times New Roman" w:hAnsi="Times New Roman" w:cs="Times New Roman"/>
         </w:rPr>
-        <w:t>his</w:t>
-      </w:r>
-      <w:r>
-        <w:rPr>
-          <w:rFonts w:ascii="Times New Roman" w:hAnsi="Times New Roman" w:cs="Times New Roman"/>
-        </w:rPr>
-        <w:t xml:space="preserve"> injuries. </w:t>
+        <w:t xml:space="preserve">injuries. </w:t>
       </w:r>
     </w:p>
     <w:p>
@@ -4974,23 +4845,7 @@
           <w:rFonts w:ascii="Times New Roman" w:hAnsi="Times New Roman" w:cs="Times New Roman"/>
           <w:b/>
         </w:rPr>
-        <w:t xml:space="preserve"> MAINTAINED BY YOUR INSURED REGARDING THE SUBJECT ACCIDENT. ADDITIONALLY, AS AN EXPRESS CONDITION OF ACCEPTANCE, A CERTIFIED DECLARATION PAGE AND A STATEMENT UNDER OATH THAT ALL POLICIES HAVE BEEN </w:t>
-      </w:r>
-      <w:proofErr w:type="gramStart"/>
-      <w:r>
-        <w:rPr>
-          <w:rFonts w:ascii="Times New Roman" w:hAnsi="Times New Roman" w:cs="Times New Roman"/>
-          <w:b/>
-        </w:rPr>
-        <w:t>TENDERED</w:t>
-      </w:r>
-      <w:proofErr w:type="gramEnd"/>
-      <w:r>
-        <w:rPr>
-          <w:rFonts w:ascii="Times New Roman" w:hAnsi="Times New Roman" w:cs="Times New Roman"/>
-          <w:b/>
-        </w:rPr>
-        <w:t xml:space="preserve"> MUST ACCOMPANY THE ACCEPTANCE. </w:t>
+        <w:t xml:space="preserve"> MAINTAINED BY YOUR INSURED REGARDING THE SUBJECT ACCIDENT. ADDITIONALLY, AS AN EXPRESS CONDITION OF ACCEPTANCE, A CERTIFIED DECLARATION PAGE AND A STATEMENT UNDER OATH THAT ALL POLICIES HAVE BEEN TENDERED MUST ACCOMPANY THE ACCEPTANCE. </w:t>
       </w:r>
       <w:r>
         <w:rPr>
@@ -5015,7 +4870,7 @@
           <w:highlight w:val="yellow"/>
           <w:u w:val="single"/>
         </w:rPr>
-        <w:t>DECEMBER 26, 2024</w:t>
+        <w:t>DECEMBER 27, 2024</w:t>
       </w:r>
       <w:r>
         <w:rPr>
@@ -5084,7 +4939,7 @@
           <w:highlight w:val="yellow"/>
           <w:u w:val="single"/>
         </w:rPr>
-        <w:t>DECEMBER 26, 2024</w:t>
+        <w:t>DECEMBER 27, 2024</w:t>
       </w:r>
       <w:r>
         <w:rPr>
@@ -5137,6 +4992,7 @@
           <w:rFonts w:ascii="Times New Roman" w:hAnsi="Times New Roman" w:cs="Times New Roman"/>
           <w:b/>
         </w:rPr>
+        <w:lastRenderedPageBreak/>
         <w:t xml:space="preserve">ACCEPTANCE MUST BE IN WRITING, AND EITHER FAXED TO (424) 429-2432 OR EMAILED TO LILLIAN@SEDLAWGROUP.COM, BY NO LATER THAN 5:00 P.M. ON </w:t>
       </w:r>
       <w:r>
@@ -5145,16 +5001,7 @@
           <w:b/>
           <w:highlight w:val="yellow"/>
         </w:rPr>
-        <w:t>SETTLEMENT_EXP_</w:t>
-      </w:r>
-      <w:proofErr w:type="gramStart"/>
-      <w:r>
-        <w:rPr>
-          <w:rFonts w:ascii="Times New Roman" w:hAnsi="Times New Roman" w:cs="Times New Roman"/>
-          <w:b/>
-          <w:highlight w:val="yellow"/>
-        </w:rPr>
-        <w:t>DATE</w:t>
+        <w:t>DECEMBER 27, 2024</w:t>
       </w:r>
       <w:r>
         <w:rPr>
@@ -5163,7 +5010,6 @@
         </w:rPr>
         <w:t>;</w:t>
       </w:r>
-      <w:proofErr w:type="gramEnd"/>
     </w:p>
     <w:p>
       <w:pPr>
@@ -5186,7 +5032,6 @@
           <w:rFonts w:ascii="Times New Roman" w:hAnsi="Times New Roman" w:cs="Times New Roman"/>
           <w:b/>
         </w:rPr>
-        <w:lastRenderedPageBreak/>
         <w:t>SEND A COPY OF A STANDARD</w:t>
       </w:r>
       <w:r>
@@ -5225,30 +5070,14 @@
           <w:b/>
           <w:highlight w:val="yellow"/>
         </w:rPr>
-        <w:t>MR. RODNEY BLOWERS</w:t>
-      </w:r>
-      <w:r>
-        <w:rPr>
-          <w:rFonts w:ascii="Times New Roman" w:hAnsi="Times New Roman" w:cs="Times New Roman"/>
-          <w:b/>
-        </w:rPr>
-        <w:t xml:space="preserve"> TO SIGN, ADDRESSED TO THE UNDERSIGNED’S ATTENTION BEFORE THE OFFER </w:t>
-      </w:r>
-      <w:proofErr w:type="gramStart"/>
-      <w:r>
-        <w:rPr>
-          <w:rFonts w:ascii="Times New Roman" w:hAnsi="Times New Roman" w:cs="Times New Roman"/>
-          <w:b/>
-        </w:rPr>
-        <w:t>EXPIRES;</w:t>
-      </w:r>
-      <w:proofErr w:type="gramEnd"/>
-      <w:r>
-        <w:rPr>
-          <w:rFonts w:ascii="Times New Roman" w:hAnsi="Times New Roman" w:cs="Times New Roman"/>
-          <w:b/>
-        </w:rPr>
-        <w:t xml:space="preserve">   </w:t>
+        <w:t>MRS. RODNEY BLOWERS</w:t>
+      </w:r>
+      <w:r>
+        <w:rPr>
+          <w:rFonts w:ascii="Times New Roman" w:hAnsi="Times New Roman" w:cs="Times New Roman"/>
+          <w:b/>
+        </w:rPr>
+        <w:t xml:space="preserve"> TO SIGN, ADDRESSED TO THE UNDERSIGNED’S ATTENTION BEFORE THE OFFER EXPIRES;   </w:t>
       </w:r>
     </w:p>
     <w:p>
@@ -5280,7 +5109,7 @@
           <w:b/>
           <w:highlight w:val="yellow"/>
         </w:rPr>
-        <w:t>MR. RODNEY BLOWERS</w:t>
+        <w:t>MRS. RODNEY BLOWERS</w:t>
       </w:r>
       <w:r>
         <w:rPr>
@@ -5308,17 +5137,8 @@
           <w:rFonts w:ascii="Times New Roman" w:hAnsi="Times New Roman" w:cs="Times New Roman"/>
           <w:b/>
         </w:rPr>
-        <w:t xml:space="preserve"> OR ANYONE ELSE FOR THAT MATTER.  INCLUSION OF ANY SUCH TERM IN THE GENERAL RELEASE WILL CONSTITUTE A REJECTION OF THIS </w:t>
-      </w:r>
-      <w:proofErr w:type="gramStart"/>
-      <w:r>
-        <w:rPr>
-          <w:rFonts w:ascii="Times New Roman" w:hAnsi="Times New Roman" w:cs="Times New Roman"/>
-          <w:b/>
-        </w:rPr>
-        <w:t>OFFER;</w:t>
-      </w:r>
-      <w:proofErr w:type="gramEnd"/>
+        <w:t xml:space="preserve"> OR ANYONE ELSE FOR THAT MATTER.  INCLUSION OF ANY SUCH TERM IN THE GENERAL RELEASE WILL CONSTITUTE A REJECTION OF THIS OFFER;</w:t>
+      </w:r>
     </w:p>
     <w:p>
       <w:pPr>
@@ -5341,17 +5161,8 @@
           <w:rFonts w:ascii="Times New Roman" w:hAnsi="Times New Roman" w:cs="Times New Roman"/>
           <w:b/>
         </w:rPr>
-        <w:t xml:space="preserve">PROVIDE A CERTIFIED COPY OF YOUR INSURED’S DECLARATION PAGE SHOWING THE POLICY </w:t>
-      </w:r>
-      <w:proofErr w:type="gramStart"/>
-      <w:r>
-        <w:rPr>
-          <w:rFonts w:ascii="Times New Roman" w:hAnsi="Times New Roman" w:cs="Times New Roman"/>
-          <w:b/>
-        </w:rPr>
-        <w:t>LIMITS;</w:t>
-      </w:r>
-      <w:proofErr w:type="gramEnd"/>
+        <w:t>PROVIDE A CERTIFIED COPY OF YOUR INSURED’S DECLARATION PAGE SHOWING THE POLICY LIMITS;</w:t>
+      </w:r>
     </w:p>
     <w:p>
       <w:pPr>
@@ -5489,7 +5300,7 @@
           <w:highlight w:val="yellow"/>
           <w:u w:val="single"/>
         </w:rPr>
-        <w:t>DECEMBER 26, 2024</w:t>
+        <w:t>DECEMBER 27, 2024</w:t>
       </w:r>
       <w:r>
         <w:rPr>
@@ -5529,55 +5340,7 @@
           <w:rFonts w:ascii="Times New Roman" w:hAnsi="Times New Roman" w:cs="Times New Roman"/>
           <w:b/>
         </w:rPr>
-        <w:t xml:space="preserve">I have enclosed herewith copies of all known records, documentation and information that you will need for evaluating each of my </w:t>
-      </w:r>
-      <w:proofErr w:type="gramStart"/>
-      <w:r>
-        <w:rPr>
-          <w:rFonts w:ascii="Times New Roman" w:hAnsi="Times New Roman" w:cs="Times New Roman"/>
-          <w:b/>
-        </w:rPr>
-        <w:t>clients</w:t>
-      </w:r>
-      <w:proofErr w:type="gramEnd"/>
-      <w:r>
-        <w:rPr>
-          <w:rFonts w:ascii="Times New Roman" w:hAnsi="Times New Roman" w:cs="Times New Roman"/>
-          <w:b/>
-        </w:rPr>
-        <w:t xml:space="preserve"> claims herein. The </w:t>
-      </w:r>
-      <w:proofErr w:type="gramStart"/>
-      <w:r>
-        <w:rPr>
-          <w:rFonts w:ascii="Times New Roman" w:hAnsi="Times New Roman" w:cs="Times New Roman"/>
-          <w:b/>
-        </w:rPr>
-        <w:t>damages</w:t>
-      </w:r>
-      <w:proofErr w:type="gramEnd"/>
-      <w:r>
-        <w:rPr>
-          <w:rFonts w:ascii="Times New Roman" w:hAnsi="Times New Roman" w:cs="Times New Roman"/>
-          <w:b/>
-        </w:rPr>
-        <w:t xml:space="preserve"> sustained by each of our clients far exceed the full aggregate policy carried by your insured. We therefore believe that you are </w:t>
-      </w:r>
-      <w:proofErr w:type="gramStart"/>
-      <w:r>
-        <w:rPr>
-          <w:rFonts w:ascii="Times New Roman" w:hAnsi="Times New Roman" w:cs="Times New Roman"/>
-          <w:b/>
-        </w:rPr>
-        <w:t>in a position</w:t>
-      </w:r>
-      <w:proofErr w:type="gramEnd"/>
-      <w:r>
-        <w:rPr>
-          <w:rFonts w:ascii="Times New Roman" w:hAnsi="Times New Roman" w:cs="Times New Roman"/>
-          <w:b/>
-        </w:rPr>
-        <w:t xml:space="preserve"> to act promptly upon this demand and tender the full aggregate policy limits carried by your insured. </w:t>
+        <w:t xml:space="preserve">I have enclosed herewith copies of all known records, documentation and information that you will need for evaluating each of my clients claims herein. The damages sustained by each of our clients far exceed the full aggregate policy carried by your insured. We therefore believe that you are in a position to act promptly upon this demand and tender the full aggregate policy limits carried by your insured. </w:t>
       </w:r>
     </w:p>
     <w:p>
@@ -5611,23 +5374,7 @@
           <w:rFonts w:ascii="Times New Roman" w:hAnsi="Times New Roman" w:cs="Times New Roman"/>
           <w:bCs/>
         </w:rPr>
-        <w:t xml:space="preserve">For your reference and file, and to expedite the issuance of </w:t>
-      </w:r>
-      <w:proofErr w:type="gramStart"/>
-      <w:r>
-        <w:rPr>
-          <w:rFonts w:ascii="Times New Roman" w:hAnsi="Times New Roman" w:cs="Times New Roman"/>
-          <w:bCs/>
-        </w:rPr>
-        <w:t>any and all</w:t>
-      </w:r>
-      <w:proofErr w:type="gramEnd"/>
-      <w:r>
-        <w:rPr>
-          <w:rFonts w:ascii="Times New Roman" w:hAnsi="Times New Roman" w:cs="Times New Roman"/>
-          <w:bCs/>
-        </w:rPr>
-        <w:t xml:space="preserve"> drafts, a copy of our firm’s W-9 form is attached and enclosed with this correspondence herein and marked as </w:t>
+        <w:t xml:space="preserve">For your reference and file, and to expedite the issuance of any and all drafts, a copy of our firm’s W-9 form is attached and enclosed with this correspondence herein and marked as </w:t>
       </w:r>
       <w:r>
         <w:rPr>
@@ -5731,15 +5478,30 @@
           <w:rFonts w:ascii="Times New Roman" w:hAnsi="Times New Roman" w:cs="Times New Roman"/>
           <w:b/>
         </w:rPr>
+        <w:lastRenderedPageBreak/>
         <w:t xml:space="preserve">Please be advised that in the event you refuse to offer our client your insured’s full policy limit for consideration, and our client is forced to litigate, due to the increased fees associates with litigation, as well as the enormous costs involved, our client has instructed this office not to accept your insured’s policy limits at that time and will pursue your insured for a verdict in excess of </w:t>
       </w:r>
       <w:r>
         <w:rPr>
           <w:rFonts w:ascii="Times New Roman" w:hAnsi="Times New Roman" w:cs="Times New Roman"/>
           <w:b/>
-        </w:rPr>
-        <w:lastRenderedPageBreak/>
-        <w:t>their policy limits, therefore, our above offer to consider settlement is valid for the purpose of this settlement demand only.</w:t>
+          <w:highlight w:val="yellow"/>
+        </w:rPr>
+        <w:t>her</w:t>
+      </w:r>
+      <w:r>
+        <w:rPr>
+          <w:rFonts w:ascii="Times New Roman" w:hAnsi="Times New Roman" w:cs="Times New Roman"/>
+          <w:b/>
+        </w:rPr>
+        <w:t xml:space="preserve"> </w:t>
+      </w:r>
+      <w:r>
+        <w:rPr>
+          <w:rFonts w:ascii="Times New Roman" w:hAnsi="Times New Roman" w:cs="Times New Roman"/>
+          <w:b/>
+        </w:rPr>
+        <w:t>policy limits, therefore, our above offer to consider settlement is valid for the purpose of this settlement demand only.</w:t>
       </w:r>
     </w:p>
     <w:p>
@@ -5770,34 +5532,137 @@
         <w:rPr>
           <w:rFonts w:ascii="Times New Roman" w:hAnsi="Times New Roman" w:cs="Times New Roman"/>
         </w:rPr>
-        <w:t xml:space="preserve">We are certain you are aware that if a judgment </w:t>
+        <w:t>We are certain you are aware that if a judgment in excess of the policy limits is entered against your insured in a lawsuit, when you have had the opportunity to settle this matter within the policy limits, your company may be held responsible for the difference (</w:t>
+      </w:r>
+      <w:proofErr w:type="spellStart"/>
+      <w:r>
+        <w:rPr>
+          <w:rFonts w:ascii="Times New Roman" w:hAnsi="Times New Roman" w:cs="Times New Roman"/>
+          <w:i/>
+        </w:rPr>
+        <w:t>Silberg</w:t>
+      </w:r>
+      <w:proofErr w:type="spellEnd"/>
+      <w:r>
+        <w:rPr>
+          <w:rFonts w:ascii="Times New Roman" w:hAnsi="Times New Roman" w:cs="Times New Roman"/>
+          <w:i/>
+        </w:rPr>
+        <w:t xml:space="preserve"> v. California Life Ins. Co.</w:t>
+      </w:r>
+      <w:r>
+        <w:rPr>
+          <w:rFonts w:ascii="Times New Roman" w:hAnsi="Times New Roman" w:cs="Times New Roman"/>
+        </w:rPr>
+        <w:t xml:space="preserve"> (1974) 11 C3d 452, 113 CR 711).</w:t>
+      </w:r>
+    </w:p>
+    <w:p>
+      <w:pPr>
+        <w:tabs>
+          <w:tab w:val="left" w:pos="540"/>
+        </w:tabs>
+        <w:ind w:left="547"/>
+        <w:jc w:val="both"/>
+        <w:rPr>
+          <w:rFonts w:ascii="Times New Roman" w:hAnsi="Times New Roman" w:cs="Times New Roman"/>
+        </w:rPr>
+      </w:pPr>
+      <w:r>
+        <w:rPr>
+          <w:rFonts w:ascii="Times New Roman" w:hAnsi="Times New Roman" w:cs="Times New Roman"/>
+        </w:rPr>
+        <w:tab/>
+      </w:r>
+      <w:r>
+        <w:rPr>
+          <w:rFonts w:ascii="Times New Roman" w:hAnsi="Times New Roman" w:cs="Times New Roman"/>
+        </w:rPr>
+        <w:tab/>
+      </w:r>
+    </w:p>
+    <w:p>
+      <w:pPr>
+        <w:tabs>
+          <w:tab w:val="left" w:pos="540"/>
+        </w:tabs>
+        <w:ind w:left="547"/>
+        <w:jc w:val="both"/>
+        <w:rPr>
+          <w:rFonts w:ascii="Times New Roman" w:hAnsi="Times New Roman" w:cs="Times New Roman"/>
+        </w:rPr>
+      </w:pPr>
+      <w:r>
+        <w:rPr>
+          <w:rFonts w:ascii="Times New Roman" w:hAnsi="Times New Roman" w:cs="Times New Roman"/>
+        </w:rPr>
+        <w:t xml:space="preserve">Again, this </w:t>
       </w:r>
       <w:proofErr w:type="gramStart"/>
       <w:r>
         <w:rPr>
           <w:rFonts w:ascii="Times New Roman" w:hAnsi="Times New Roman" w:cs="Times New Roman"/>
         </w:rPr>
-        <w:t>in excess of</w:t>
+        <w:t>offer</w:t>
       </w:r>
       <w:proofErr w:type="gramEnd"/>
       <w:r>
         <w:rPr>
           <w:rFonts w:ascii="Times New Roman" w:hAnsi="Times New Roman" w:cs="Times New Roman"/>
         </w:rPr>
-        <w:t xml:space="preserve"> the policy limits is entered against your insured in a lawsuit, when you have had the opportunity to settle this matter within the policy limits, your company may be held responsible for the difference (</w:t>
-      </w:r>
-      <w:r>
-        <w:rPr>
-          <w:rFonts w:ascii="Times New Roman" w:hAnsi="Times New Roman" w:cs="Times New Roman"/>
-          <w:i/>
-        </w:rPr>
-        <w:t>Silberg v. California Life Ins. Co.</w:t>
-      </w:r>
-      <w:r>
-        <w:rPr>
-          <w:rFonts w:ascii="Times New Roman" w:hAnsi="Times New Roman" w:cs="Times New Roman"/>
-        </w:rPr>
-        <w:t xml:space="preserve"> (1974) 11 C3d 452, 113 CR 711).</w:t>
+        <w:t xml:space="preserve"> to settle our client’s claims for the</w:t>
+      </w:r>
+      <w:r>
+        <w:rPr>
+          <w:rFonts w:ascii="Times New Roman" w:hAnsi="Times New Roman" w:cs="Times New Roman"/>
+          <w:b/>
+        </w:rPr>
+        <w:t xml:space="preserve"> </w:t>
+      </w:r>
+      <w:r>
+        <w:rPr>
+          <w:rFonts w:ascii="Times New Roman" w:hAnsi="Times New Roman" w:cs="Times New Roman"/>
+          <w:b/>
+          <w:u w:val="single"/>
+        </w:rPr>
+        <w:t>POLICY LIMITS</w:t>
+      </w:r>
+      <w:r>
+        <w:rPr>
+          <w:rFonts w:ascii="Times New Roman" w:hAnsi="Times New Roman" w:cs="Times New Roman"/>
+        </w:rPr>
+        <w:t xml:space="preserve"> maintained by your insured regarding the subject accident shall remain open for acceptance until </w:t>
+      </w:r>
+      <w:r>
+        <w:rPr>
+          <w:rFonts w:ascii="Times New Roman" w:hAnsi="Times New Roman" w:cs="Times New Roman"/>
+          <w:b/>
+          <w:u w:val="single"/>
+        </w:rPr>
+        <w:t xml:space="preserve">5:00 P.M. ON </w:t>
+      </w:r>
+      <w:r>
+        <w:rPr>
+          <w:rFonts w:ascii="Times New Roman" w:hAnsi="Times New Roman" w:cs="Times New Roman"/>
+          <w:b/>
+          <w:highlight w:val="yellow"/>
+          <w:u w:val="single"/>
+        </w:rPr>
+        <w:t>DECEMBER 27, 2024</w:t>
+      </w:r>
+      <w:r>
+        <w:rPr>
+          <w:rFonts w:ascii="Times New Roman" w:hAnsi="Times New Roman" w:cs="Times New Roman"/>
+          <w:b/>
+          <w:highlight w:val="yellow"/>
+        </w:rPr>
+        <w:t>.</w:t>
+      </w:r>
+      <w:r>
+        <w:rPr>
+          <w:rFonts w:ascii="Times New Roman" w:hAnsi="Times New Roman" w:cs="Times New Roman"/>
+        </w:rPr>
+        <w:t xml:space="preserve"> </w:t>
       </w:r>
     </w:p>
     <w:p>
@@ -5811,18 +5676,6 @@
           <w:rFonts w:ascii="Times New Roman" w:hAnsi="Times New Roman" w:cs="Times New Roman"/>
         </w:rPr>
       </w:pPr>
-      <w:r>
-        <w:rPr>
-          <w:rFonts w:ascii="Times New Roman" w:hAnsi="Times New Roman" w:cs="Times New Roman"/>
-        </w:rPr>
-        <w:tab/>
-      </w:r>
-      <w:r>
-        <w:rPr>
-          <w:rFonts w:ascii="Times New Roman" w:hAnsi="Times New Roman" w:cs="Times New Roman"/>
-        </w:rPr>
-        <w:tab/>
-      </w:r>
     </w:p>
     <w:p>
       <w:pPr>
@@ -5839,81 +5692,131 @@
         <w:rPr>
           <w:rFonts w:ascii="Times New Roman" w:hAnsi="Times New Roman" w:cs="Times New Roman"/>
         </w:rPr>
-        <w:t xml:space="preserve">Again, this </w:t>
-      </w:r>
-      <w:proofErr w:type="gramStart"/>
-      <w:r>
-        <w:rPr>
-          <w:rFonts w:ascii="Times New Roman" w:hAnsi="Times New Roman" w:cs="Times New Roman"/>
-        </w:rPr>
-        <w:t>offer</w:t>
-      </w:r>
-      <w:proofErr w:type="gramEnd"/>
-      <w:r>
-        <w:rPr>
-          <w:rFonts w:ascii="Times New Roman" w:hAnsi="Times New Roman" w:cs="Times New Roman"/>
-        </w:rPr>
-        <w:t xml:space="preserve"> to settle our client’s claims for the</w:t>
-      </w:r>
-      <w:r>
-        <w:rPr>
-          <w:rFonts w:ascii="Times New Roman" w:hAnsi="Times New Roman" w:cs="Times New Roman"/>
-          <w:b/>
+        <w:t>After that time, this offer will be withdrawn, and we will be forced to serve your insured with a lawsuit. Please review the enclosed information and contact our office promptly to discuss a mutually satisfactory resolution of this claim.</w:t>
+      </w:r>
+    </w:p>
+    <w:p>
+      <w:pPr>
+        <w:tabs>
+          <w:tab w:val="left" w:pos="540"/>
+        </w:tabs>
+        <w:ind w:left="547"/>
+        <w:jc w:val="both"/>
+        <w:rPr>
+          <w:rFonts w:ascii="Times New Roman" w:hAnsi="Times New Roman" w:cs="Times New Roman"/>
+        </w:rPr>
+      </w:pPr>
+    </w:p>
+    <w:p>
+      <w:pPr>
+        <w:tabs>
+          <w:tab w:val="left" w:pos="540"/>
+        </w:tabs>
+        <w:ind w:left="547"/>
+        <w:jc w:val="both"/>
+        <w:rPr>
+          <w:rFonts w:ascii="Times New Roman" w:eastAsia="Times New Roman" w:hAnsi="Times New Roman" w:cs="Times New Roman"/>
+        </w:rPr>
+      </w:pPr>
+      <w:r>
+        <w:rPr>
+          <w:rFonts w:ascii="Times New Roman" w:hAnsi="Times New Roman" w:cs="Times New Roman"/>
+        </w:rPr>
+        <w:t xml:space="preserve">Taking into consideration the strong evidence of liability in this case, and the substantial injuries suffered by my client, we believe </w:t>
+      </w:r>
+      <w:r>
+        <w:rPr>
+          <w:rFonts w:ascii="Times New Roman" w:hAnsi="Times New Roman" w:cs="Times New Roman"/>
+          <w:highlight w:val="yellow"/>
+        </w:rPr>
+        <w:t>Mr. Mosqueda Sr and Mrs. Mosqueda Jr</w:t>
+      </w:r>
+      <w:r>
+        <w:rPr>
+          <w:rFonts w:ascii="Times New Roman" w:hAnsi="Times New Roman" w:cs="Times New Roman"/>
+        </w:rPr>
+        <w:t xml:space="preserve"> will recover at least the aforementioned amount if this case goes to trial. </w:t>
+      </w:r>
+      <w:r>
+        <w:rPr>
+          <w:rFonts w:ascii="Times New Roman" w:eastAsia="Times New Roman" w:hAnsi="Times New Roman" w:cs="Times New Roman"/>
+        </w:rPr>
+        <w:t xml:space="preserve">Juries are receptive to claims for general damages when </w:t>
+      </w:r>
+      <w:r>
+        <w:rPr>
+          <w:rFonts w:ascii="Times New Roman" w:eastAsia="Times New Roman" w:hAnsi="Times New Roman" w:cs="Times New Roman"/>
+          <w:highlight w:val="yellow"/>
+        </w:rPr>
+        <w:t>healthy men or women loses</w:t>
+      </w:r>
+      <w:r>
+        <w:rPr>
+          <w:rFonts w:ascii="Times New Roman" w:eastAsia="Times New Roman" w:hAnsi="Times New Roman" w:cs="Times New Roman"/>
         </w:rPr>
         <w:t xml:space="preserve"> </w:t>
       </w:r>
       <w:r>
         <w:rPr>
-          <w:rFonts w:ascii="Times New Roman" w:hAnsi="Times New Roman" w:cs="Times New Roman"/>
-          <w:b/>
-          <w:u w:val="single"/>
-        </w:rPr>
-        <w:t>POLICY LIMITS</w:t>
-      </w:r>
-      <w:r>
-        <w:rPr>
-          <w:rFonts w:ascii="Times New Roman" w:hAnsi="Times New Roman" w:cs="Times New Roman"/>
-        </w:rPr>
-        <w:t xml:space="preserve"> maintained by your insured regarding the </w:t>
-      </w:r>
-      <w:proofErr w:type="gramStart"/>
-      <w:r>
-        <w:rPr>
-          <w:rFonts w:ascii="Times New Roman" w:hAnsi="Times New Roman" w:cs="Times New Roman"/>
-        </w:rPr>
-        <w:t>subject accident</w:t>
-      </w:r>
-      <w:proofErr w:type="gramEnd"/>
-      <w:r>
-        <w:rPr>
-          <w:rFonts w:ascii="Times New Roman" w:hAnsi="Times New Roman" w:cs="Times New Roman"/>
-        </w:rPr>
-        <w:t xml:space="preserve"> shall remain open for acceptance until </w:t>
-      </w:r>
-      <w:r>
-        <w:rPr>
-          <w:rFonts w:ascii="Times New Roman" w:hAnsi="Times New Roman" w:cs="Times New Roman"/>
-          <w:b/>
-          <w:u w:val="single"/>
-        </w:rPr>
-        <w:t xml:space="preserve">5:00 P.M. ON </w:t>
-      </w:r>
-      <w:r>
-        <w:rPr>
-          <w:rFonts w:ascii="Times New Roman" w:hAnsi="Times New Roman" w:cs="Times New Roman"/>
-          <w:b/>
-          <w:highlight w:val="yellow"/>
-          <w:u w:val="single"/>
-        </w:rPr>
-        <w:t>DECEMBER 26, 2024</w:t>
-      </w:r>
-      <w:r>
-        <w:rPr>
-          <w:rFonts w:ascii="Times New Roman" w:hAnsi="Times New Roman" w:cs="Times New Roman"/>
-          <w:b/>
-          <w:highlight w:val="yellow"/>
-        </w:rPr>
-        <w:t>.</w:t>
+          <w:rFonts w:ascii="Times New Roman" w:eastAsia="Times New Roman" w:hAnsi="Times New Roman" w:cs="Times New Roman"/>
+          <w:highlight w:val="yellow"/>
+        </w:rPr>
+        <w:t>their</w:t>
+      </w:r>
+      <w:r>
+        <w:rPr>
+          <w:rFonts w:ascii="Times New Roman" w:eastAsia="Times New Roman" w:hAnsi="Times New Roman" w:cs="Times New Roman"/>
+        </w:rPr>
+        <w:t xml:space="preserve"> means of livelihood and the ability to enjoy recreational and familial activities</w:t>
+      </w:r>
+      <w:r>
+        <w:rPr>
+          <w:rFonts w:ascii="Times New Roman" w:eastAsia="Times New Roman" w:hAnsi="Times New Roman" w:cs="Times New Roman"/>
+        </w:rPr>
+        <w:t xml:space="preserve"> because of physical injury. </w:t>
+      </w:r>
+    </w:p>
+    <w:p>
+      <w:pPr>
+        <w:tabs>
+          <w:tab w:val="left" w:pos="540"/>
+        </w:tabs>
+        <w:ind w:left="547"/>
+        <w:jc w:val="both"/>
+        <w:rPr>
+          <w:rFonts w:ascii="Times New Roman" w:eastAsia="Times New Roman" w:hAnsi="Times New Roman" w:cs="Times New Roman"/>
+        </w:rPr>
+      </w:pPr>
+    </w:p>
+    <w:p>
+      <w:pPr>
+        <w:tabs>
+          <w:tab w:val="left" w:pos="540"/>
+        </w:tabs>
+        <w:ind w:left="547"/>
+        <w:jc w:val="both"/>
+        <w:rPr>
+          <w:rFonts w:ascii="Times New Roman" w:eastAsia="Times New Roman" w:hAnsi="Times New Roman" w:cs="Times New Roman"/>
+        </w:rPr>
+      </w:pPr>
+      <w:r>
+        <w:rPr>
+          <w:rFonts w:ascii="Times New Roman" w:eastAsia="Times New Roman" w:hAnsi="Times New Roman" w:cs="Times New Roman"/>
+        </w:rPr>
+        <w:t xml:space="preserve">Here, if settlement discussions prove unsuccessful, we anticipate that a </w:t>
+      </w:r>
+      <w:r>
+        <w:rPr>
+          <w:rFonts w:ascii="Times New Roman" w:hAnsi="Times New Roman" w:cs="Times New Roman"/>
+        </w:rPr>
+        <w:t xml:space="preserve">reasonable jury, in our opinion, would have little difficulty in awarding </w:t>
+      </w:r>
+      <w:r>
+        <w:rPr>
+          <w:rFonts w:ascii="Times New Roman" w:hAnsi="Times New Roman" w:cs="Times New Roman"/>
+          <w:highlight w:val="yellow"/>
+        </w:rPr>
+        <w:t>Mr. Mosqueda Sr and Mrs. Mosqueda Jr</w:t>
       </w:r>
       <w:r>
         <w:rPr>
@@ -5921,6 +5824,57 @@
         </w:rPr>
         <w:t xml:space="preserve"> </w:t>
       </w:r>
+      <w:r>
+        <w:rPr>
+          <w:rFonts w:ascii="Times New Roman" w:eastAsia="Times New Roman" w:hAnsi="Times New Roman" w:cs="Times New Roman"/>
+        </w:rPr>
+        <w:t xml:space="preserve">general damages that are three to six times </w:t>
+      </w:r>
+      <w:r>
+        <w:rPr>
+          <w:rFonts w:ascii="Times New Roman" w:eastAsia="Times New Roman" w:hAnsi="Times New Roman" w:cs="Times New Roman"/>
+          <w:highlight w:val="yellow"/>
+        </w:rPr>
+        <w:t>their</w:t>
+      </w:r>
+      <w:r>
+        <w:rPr>
+          <w:rFonts w:ascii="Times New Roman" w:eastAsia="Times New Roman" w:hAnsi="Times New Roman" w:cs="Times New Roman"/>
+        </w:rPr>
+        <w:t xml:space="preserve"> special damages</w:t>
+      </w:r>
+      <w:r>
+        <w:rPr>
+          <w:rFonts w:ascii="Times New Roman" w:hAnsi="Times New Roman" w:cs="Times New Roman"/>
+        </w:rPr>
+        <w:t xml:space="preserve"> and possibly more. As you are well aware, personal injuries similar to my clients have been settled, and juries have awarded verdicts far in excess of our client’s settlement demand, especially in light of </w:t>
+      </w:r>
+      <w:r>
+        <w:rPr>
+          <w:rFonts w:ascii="Times New Roman" w:hAnsi="Times New Roman" w:cs="Times New Roman"/>
+          <w:highlight w:val="yellow"/>
+        </w:rPr>
+        <w:t>Mr. Mosqueda Sr and Mrs. Mosqueda Jr</w:t>
+      </w:r>
+      <w:r>
+        <w:rPr>
+          <w:rFonts w:ascii="Times New Roman" w:hAnsi="Times New Roman" w:cs="Times New Roman"/>
+          <w:highlight w:val="yellow"/>
+        </w:rPr>
+        <w:t>’</w:t>
+      </w:r>
+      <w:r>
+        <w:rPr>
+          <w:rFonts w:ascii="Times New Roman" w:hAnsi="Times New Roman" w:cs="Times New Roman"/>
+        </w:rPr>
+        <w:t>s</w:t>
+      </w:r>
+      <w:r>
+        <w:rPr>
+          <w:rFonts w:ascii="Times New Roman" w:hAnsi="Times New Roman" w:cs="Times New Roman"/>
+        </w:rPr>
+        <w:t xml:space="preserve"> injuries. We anticipate your evaluation of our client’s settlement demand in light of this factor.</w:t>
+      </w:r>
     </w:p>
     <w:p>
       <w:pPr>
@@ -5942,94 +5896,44 @@
         <w:ind w:left="547"/>
         <w:jc w:val="both"/>
         <w:rPr>
-          <w:rFonts w:ascii="Times New Roman" w:hAnsi="Times New Roman" w:cs="Times New Roman"/>
-        </w:rPr>
-      </w:pPr>
-      <w:r>
-        <w:rPr>
-          <w:rFonts w:ascii="Times New Roman" w:hAnsi="Times New Roman" w:cs="Times New Roman"/>
-        </w:rPr>
-        <w:t>After that time, this offer will be withdrawn, and we will be forced to serve your insured with a lawsuit. Please review the enclosed information and contact our office promptly to discuss a mutually satisfactory resolution of this claim.</w:t>
-      </w:r>
-    </w:p>
-    <w:p>
-      <w:pPr>
-        <w:tabs>
-          <w:tab w:val="left" w:pos="540"/>
-        </w:tabs>
-        <w:ind w:left="547"/>
-        <w:jc w:val="both"/>
-        <w:rPr>
-          <w:rFonts w:ascii="Times New Roman" w:hAnsi="Times New Roman" w:cs="Times New Roman"/>
-        </w:rPr>
-      </w:pPr>
-    </w:p>
-    <w:p>
-      <w:pPr>
-        <w:tabs>
-          <w:tab w:val="left" w:pos="540"/>
-        </w:tabs>
-        <w:ind w:left="547"/>
-        <w:jc w:val="both"/>
-        <w:rPr>
           <w:rFonts w:ascii="Times New Roman" w:eastAsia="Times New Roman" w:hAnsi="Times New Roman" w:cs="Times New Roman"/>
         </w:rPr>
       </w:pPr>
       <w:r>
         <w:rPr>
-          <w:rFonts w:ascii="Times New Roman" w:hAnsi="Times New Roman" w:cs="Times New Roman"/>
-        </w:rPr>
-        <w:t xml:space="preserve">Taking into consideration the strong evidence of liability in this case, and the substantial injuries suffered by my client, we believe </w:t>
-      </w:r>
-      <w:r>
-        <w:rPr>
-          <w:rFonts w:ascii="Times New Roman" w:hAnsi="Times New Roman" w:cs="Times New Roman"/>
-          <w:highlight w:val="yellow"/>
-        </w:rPr>
-        <w:t>Mr. Mosqueda Jr</w:t>
-      </w:r>
-      <w:r>
-        <w:rPr>
-          <w:rFonts w:ascii="Times New Roman" w:hAnsi="Times New Roman" w:cs="Times New Roman"/>
-        </w:rPr>
-        <w:t xml:space="preserve"> will recover at least the </w:t>
-      </w:r>
-      <w:proofErr w:type="gramStart"/>
-      <w:r>
-        <w:rPr>
-          <w:rFonts w:ascii="Times New Roman" w:hAnsi="Times New Roman" w:cs="Times New Roman"/>
-        </w:rPr>
-        <w:t>aforementioned amount</w:t>
-      </w:r>
-      <w:proofErr w:type="gramEnd"/>
-      <w:r>
-        <w:rPr>
-          <w:rFonts w:ascii="Times New Roman" w:hAnsi="Times New Roman" w:cs="Times New Roman"/>
-        </w:rPr>
-        <w:t xml:space="preserve"> if this case goes to trial. </w:t>
-      </w:r>
-      <w:r>
-        <w:rPr>
           <w:rFonts w:ascii="Times New Roman" w:eastAsia="Times New Roman" w:hAnsi="Times New Roman" w:cs="Times New Roman"/>
         </w:rPr>
-        <w:t xml:space="preserve">Juries are receptive to claims for general damages when </w:t>
+        <w:t xml:space="preserve">Based on the foregoing facts, we respectfully request that </w:t>
       </w:r>
       <w:r>
         <w:rPr>
           <w:rFonts w:ascii="Times New Roman" w:eastAsia="Times New Roman" w:hAnsi="Times New Roman" w:cs="Times New Roman"/>
-        </w:rPr>
-        <w:t xml:space="preserve">a healthy </w:t>
+          <w:highlight w:val="yellow"/>
+        </w:rPr>
+        <w:t>Mercury Insurance Company</w:t>
       </w:r>
       <w:r>
         <w:rPr>
           <w:rFonts w:ascii="Times New Roman" w:eastAsia="Times New Roman" w:hAnsi="Times New Roman" w:cs="Times New Roman"/>
-          <w:highlight w:val="yellow"/>
-        </w:rPr>
+        </w:rPr>
+        <w:t xml:space="preserve"> </w:t>
       </w:r>
       <w:r>
         <w:rPr>
           <w:rFonts w:ascii="Times New Roman" w:eastAsia="Times New Roman" w:hAnsi="Times New Roman" w:cs="Times New Roman"/>
         </w:rPr>
+        <w:t xml:space="preserve">consider its initial response so as to represent an offer that reasonably puts our client in the </w:t>
+      </w:r>
+      <w:r>
+        <w:rPr>
+          <w:rFonts w:ascii="Times New Roman" w:eastAsia="Times New Roman" w:hAnsi="Times New Roman" w:cs="Times New Roman"/>
+        </w:rPr>
+        <w:t>position,</w:t>
+      </w:r>
+      <w:r>
+        <w:rPr>
+          <w:rFonts w:ascii="Times New Roman" w:eastAsia="Times New Roman" w:hAnsi="Times New Roman" w:cs="Times New Roman"/>
+        </w:rPr>
         <w:t xml:space="preserve"> </w:t>
       </w:r>
       <w:r>
@@ -6037,7 +5941,7 @@
           <w:rFonts w:ascii="Times New Roman" w:eastAsia="Times New Roman" w:hAnsi="Times New Roman" w:cs="Times New Roman"/>
           <w:highlight w:val="yellow"/>
         </w:rPr>
-        <w:t>they</w:t>
+        <w:t>they were</w:t>
       </w:r>
       <w:r>
         <w:rPr>
@@ -6049,313 +5953,38 @@
         <w:rPr>
           <w:rFonts w:ascii="Times New Roman" w:eastAsia="Times New Roman" w:hAnsi="Times New Roman" w:cs="Times New Roman"/>
         </w:rPr>
-        <w:t>lose</w:t>
+        <w:t>in before this loss</w:t>
       </w:r>
       <w:r>
         <w:rPr>
           <w:rFonts w:ascii="Times New Roman" w:eastAsia="Times New Roman" w:hAnsi="Times New Roman" w:cs="Times New Roman"/>
         </w:rPr>
-        <w:t>s</w:t>
+        <w:t>, which is nothing less than the tender of your insured’s policy limits</w:t>
       </w:r>
       <w:r>
         <w:rPr>
           <w:rFonts w:ascii="Times New Roman" w:eastAsia="Times New Roman" w:hAnsi="Times New Roman" w:cs="Times New Roman"/>
         </w:rPr>
+        <w:t xml:space="preserve">. We trust that </w:t>
+      </w:r>
+      <w:r>
+        <w:rPr>
+          <w:rFonts w:ascii="Times New Roman" w:eastAsia="Times New Roman" w:hAnsi="Times New Roman" w:cs="Times New Roman"/>
+          <w:highlight w:val="yellow"/>
+        </w:rPr>
+        <w:t>Mercury Insurance Company</w:t>
+      </w:r>
+      <w:r>
+        <w:rPr>
+          <w:rFonts w:ascii="Times New Roman" w:eastAsia="Times New Roman" w:hAnsi="Times New Roman" w:cs="Times New Roman"/>
+        </w:rPr>
         <w:t xml:space="preserve"> </w:t>
       </w:r>
       <w:r>
         <w:rPr>
           <w:rFonts w:ascii="Times New Roman" w:eastAsia="Times New Roman" w:hAnsi="Times New Roman" w:cs="Times New Roman"/>
-          <w:highlight w:val="yellow"/>
-        </w:rPr>
-        <w:t>their</w:t>
-      </w:r>
-      <w:r>
-        <w:rPr>
-          <w:rFonts w:ascii="Times New Roman" w:eastAsia="Times New Roman" w:hAnsi="Times New Roman" w:cs="Times New Roman"/>
-        </w:rPr>
-        <w:t xml:space="preserve"> means of livelihood and the ability to enjoy recreational and familial activities</w:t>
-      </w:r>
-      <w:r>
-        <w:rPr>
-          <w:rFonts w:ascii="Times New Roman" w:eastAsia="Times New Roman" w:hAnsi="Times New Roman" w:cs="Times New Roman"/>
-        </w:rPr>
-        <w:t xml:space="preserve"> because of physical injury. </w:t>
-      </w:r>
-    </w:p>
-    <w:p>
-      <w:pPr>
-        <w:tabs>
-          <w:tab w:val="left" w:pos="540"/>
-        </w:tabs>
-        <w:ind w:left="547"/>
-        <w:jc w:val="both"/>
-        <w:rPr>
-          <w:rFonts w:ascii="Times New Roman" w:eastAsia="Times New Roman" w:hAnsi="Times New Roman" w:cs="Times New Roman"/>
-        </w:rPr>
-      </w:pPr>
-    </w:p>
-    <w:p>
-      <w:pPr>
-        <w:tabs>
-          <w:tab w:val="left" w:pos="540"/>
-        </w:tabs>
-        <w:ind w:left="547"/>
-        <w:jc w:val="both"/>
-        <w:rPr>
-          <w:rFonts w:ascii="Times New Roman" w:eastAsia="Times New Roman" w:hAnsi="Times New Roman" w:cs="Times New Roman"/>
-        </w:rPr>
-      </w:pPr>
-      <w:r>
-        <w:rPr>
-          <w:rFonts w:ascii="Times New Roman" w:eastAsia="Times New Roman" w:hAnsi="Times New Roman" w:cs="Times New Roman"/>
-        </w:rPr>
-        <w:t xml:space="preserve">Here, if settlement discussions prove unsuccessful, we anticipate that a </w:t>
-      </w:r>
-      <w:r>
-        <w:rPr>
-          <w:rFonts w:ascii="Times New Roman" w:hAnsi="Times New Roman" w:cs="Times New Roman"/>
-        </w:rPr>
-        <w:t xml:space="preserve">reasonable jury, in our opinion, would have little difficulty in awarding </w:t>
-      </w:r>
-      <w:r>
-        <w:rPr>
-          <w:rFonts w:ascii="Times New Roman" w:hAnsi="Times New Roman" w:cs="Times New Roman"/>
-          <w:highlight w:val="yellow"/>
-        </w:rPr>
-        <w:t>Mr. Mosqueda Jr</w:t>
-      </w:r>
-      <w:r>
-        <w:rPr>
-          <w:rFonts w:ascii="Times New Roman" w:hAnsi="Times New Roman" w:cs="Times New Roman"/>
-        </w:rPr>
-        <w:t xml:space="preserve"> </w:t>
-      </w:r>
-      <w:r>
-        <w:rPr>
-          <w:rFonts w:ascii="Times New Roman" w:eastAsia="Times New Roman" w:hAnsi="Times New Roman" w:cs="Times New Roman"/>
-        </w:rPr>
-        <w:t xml:space="preserve">general damages that are three to six times </w:t>
-      </w:r>
-      <w:r>
-        <w:rPr>
-          <w:rFonts w:ascii="Times New Roman" w:eastAsia="Times New Roman" w:hAnsi="Times New Roman" w:cs="Times New Roman"/>
-          <w:highlight w:val="yellow"/>
-        </w:rPr>
-        <w:t>their</w:t>
-      </w:r>
-      <w:r>
-        <w:rPr>
-          <w:rFonts w:ascii="Times New Roman" w:eastAsia="Times New Roman" w:hAnsi="Times New Roman" w:cs="Times New Roman"/>
-        </w:rPr>
-        <w:t xml:space="preserve"> special damages</w:t>
-      </w:r>
-      <w:r>
-        <w:rPr>
-          <w:rFonts w:ascii="Times New Roman" w:hAnsi="Times New Roman" w:cs="Times New Roman"/>
-        </w:rPr>
-        <w:t xml:space="preserve"> and possibly more. As you are </w:t>
-      </w:r>
-      <w:proofErr w:type="gramStart"/>
-      <w:r>
-        <w:rPr>
-          <w:rFonts w:ascii="Times New Roman" w:hAnsi="Times New Roman" w:cs="Times New Roman"/>
-        </w:rPr>
-        <w:t>well aware</w:t>
-      </w:r>
-      <w:proofErr w:type="gramEnd"/>
-      <w:r>
-        <w:rPr>
-          <w:rFonts w:ascii="Times New Roman" w:hAnsi="Times New Roman" w:cs="Times New Roman"/>
-        </w:rPr>
-        <w:t xml:space="preserve">, personal injuries similar to my </w:t>
-      </w:r>
-      <w:proofErr w:type="gramStart"/>
-      <w:r>
-        <w:rPr>
-          <w:rFonts w:ascii="Times New Roman" w:hAnsi="Times New Roman" w:cs="Times New Roman"/>
-        </w:rPr>
-        <w:t>clients</w:t>
-      </w:r>
-      <w:proofErr w:type="gramEnd"/>
-      <w:r>
-        <w:rPr>
-          <w:rFonts w:ascii="Times New Roman" w:hAnsi="Times New Roman" w:cs="Times New Roman"/>
-        </w:rPr>
-        <w:t xml:space="preserve"> have been settled, and juries have awarded verdicts far in excess of our client’s settlement demand, especially in light of </w:t>
-      </w:r>
-      <w:r>
-        <w:rPr>
-          <w:rFonts w:ascii="Times New Roman" w:hAnsi="Times New Roman" w:cs="Times New Roman"/>
-          <w:highlight w:val="yellow"/>
-        </w:rPr>
-        <w:t>Mr. Mosqueda Jr</w:t>
-      </w:r>
-      <w:r>
-        <w:rPr>
-          <w:rFonts w:ascii="Times New Roman" w:hAnsi="Times New Roman" w:cs="Times New Roman"/>
-          <w:highlight w:val="yellow"/>
-        </w:rPr>
-        <w:t>’</w:t>
-      </w:r>
-      <w:r>
-        <w:rPr>
-          <w:rFonts w:ascii="Times New Roman" w:hAnsi="Times New Roman" w:cs="Times New Roman"/>
-        </w:rPr>
-        <w:t>s</w:t>
-      </w:r>
-      <w:r>
-        <w:rPr>
-          <w:rFonts w:ascii="Times New Roman" w:hAnsi="Times New Roman" w:cs="Times New Roman"/>
-        </w:rPr>
-        <w:t xml:space="preserve"> injuries. We anticipate your evaluation of our client’s settlement demand </w:t>
-      </w:r>
-      <w:proofErr w:type="gramStart"/>
-      <w:r>
-        <w:rPr>
-          <w:rFonts w:ascii="Times New Roman" w:hAnsi="Times New Roman" w:cs="Times New Roman"/>
-        </w:rPr>
-        <w:t>in light of</w:t>
-      </w:r>
-      <w:proofErr w:type="gramEnd"/>
-      <w:r>
-        <w:rPr>
-          <w:rFonts w:ascii="Times New Roman" w:hAnsi="Times New Roman" w:cs="Times New Roman"/>
-        </w:rPr>
-        <w:t xml:space="preserve"> this factor.</w:t>
-      </w:r>
-    </w:p>
-    <w:p>
-      <w:pPr>
-        <w:tabs>
-          <w:tab w:val="left" w:pos="540"/>
-        </w:tabs>
-        <w:ind w:left="547"/>
-        <w:jc w:val="both"/>
-        <w:rPr>
-          <w:rFonts w:ascii="Times New Roman" w:hAnsi="Times New Roman" w:cs="Times New Roman"/>
-        </w:rPr>
-      </w:pPr>
-    </w:p>
-    <w:p>
-      <w:pPr>
-        <w:tabs>
-          <w:tab w:val="left" w:pos="540"/>
-        </w:tabs>
-        <w:ind w:left="547"/>
-        <w:jc w:val="both"/>
-        <w:rPr>
-          <w:rFonts w:ascii="Times New Roman" w:hAnsi="Times New Roman" w:cs="Times New Roman"/>
-        </w:rPr>
-      </w:pPr>
-      <w:r>
-        <w:rPr>
-          <w:rFonts w:ascii="Times New Roman" w:eastAsia="Times New Roman" w:hAnsi="Times New Roman" w:cs="Times New Roman"/>
-        </w:rPr>
-        <w:t xml:space="preserve">Based on the foregoing facts, we respectfully request that </w:t>
-      </w:r>
-      <w:r>
-        <w:rPr>
-          <w:rFonts w:ascii="Times New Roman" w:eastAsia="Times New Roman" w:hAnsi="Times New Roman" w:cs="Times New Roman"/>
-          <w:highlight w:val="yellow"/>
-        </w:rPr>
-        <w:t>Mercury Insurance Company</w:t>
-      </w:r>
-      <w:r>
-        <w:rPr>
-          <w:rFonts w:ascii="Times New Roman" w:eastAsia="Times New Roman" w:hAnsi="Times New Roman" w:cs="Times New Roman"/>
-        </w:rPr>
-        <w:t xml:space="preserve"> </w:t>
-      </w:r>
-      <w:r>
-        <w:rPr>
-          <w:rFonts w:ascii="Times New Roman" w:eastAsia="Times New Roman" w:hAnsi="Times New Roman" w:cs="Times New Roman"/>
-        </w:rPr>
-        <w:t xml:space="preserve">consider its initial response </w:t>
-      </w:r>
-      <w:proofErr w:type="gramStart"/>
-      <w:r>
-        <w:rPr>
-          <w:rFonts w:ascii="Times New Roman" w:eastAsia="Times New Roman" w:hAnsi="Times New Roman" w:cs="Times New Roman"/>
-        </w:rPr>
-        <w:t>so as to</w:t>
-      </w:r>
-      <w:proofErr w:type="gramEnd"/>
-      <w:r>
-        <w:rPr>
-          <w:rFonts w:ascii="Times New Roman" w:eastAsia="Times New Roman" w:hAnsi="Times New Roman" w:cs="Times New Roman"/>
-        </w:rPr>
-        <w:t xml:space="preserve"> represent an offer that reasonably puts our client in the </w:t>
-      </w:r>
-      <w:r>
-        <w:rPr>
-          <w:rFonts w:ascii="Times New Roman" w:eastAsia="Times New Roman" w:hAnsi="Times New Roman" w:cs="Times New Roman"/>
-        </w:rPr>
-        <w:t>position,</w:t>
-      </w:r>
-      <w:r>
-        <w:rPr>
-          <w:rFonts w:ascii="Times New Roman" w:eastAsia="Times New Roman" w:hAnsi="Times New Roman" w:cs="Times New Roman"/>
-        </w:rPr>
-        <w:t xml:space="preserve"> </w:t>
-      </w:r>
-      <w:r>
-        <w:rPr>
-          <w:rFonts w:ascii="Times New Roman" w:eastAsia="Times New Roman" w:hAnsi="Times New Roman" w:cs="Times New Roman"/>
-          <w:highlight w:val="yellow"/>
-        </w:rPr>
-        <w:t>they</w:t>
-      </w:r>
-      <w:r>
-        <w:rPr>
-          <w:rFonts w:ascii="Times New Roman" w:eastAsia="Times New Roman" w:hAnsi="Times New Roman" w:cs="Times New Roman"/>
-        </w:rPr>
-        <w:t xml:space="preserve"> was in before this loss</w:t>
-      </w:r>
-      <w:r>
-        <w:rPr>
-          <w:rFonts w:ascii="Times New Roman" w:eastAsia="Times New Roman" w:hAnsi="Times New Roman" w:cs="Times New Roman"/>
-        </w:rPr>
-        <w:t>, which is nothing less than the tender of your insured’s policy limits</w:t>
-      </w:r>
-      <w:r>
-        <w:rPr>
-          <w:rFonts w:ascii="Times New Roman" w:eastAsia="Times New Roman" w:hAnsi="Times New Roman" w:cs="Times New Roman"/>
-        </w:rPr>
-        <w:t xml:space="preserve">. We trust that </w:t>
-      </w:r>
-      <w:r>
-        <w:rPr>
-          <w:rFonts w:ascii="Times New Roman" w:eastAsia="Times New Roman" w:hAnsi="Times New Roman" w:cs="Times New Roman"/>
-          <w:highlight w:val="yellow"/>
-        </w:rPr>
-        <w:t>Mercury Insurance Company</w:t>
-      </w:r>
-      <w:r>
-        <w:rPr>
-          <w:rFonts w:ascii="Times New Roman" w:eastAsia="Times New Roman" w:hAnsi="Times New Roman" w:cs="Times New Roman"/>
-        </w:rPr>
-        <w:t xml:space="preserve"> </w:t>
-      </w:r>
-      <w:r>
-        <w:rPr>
-          <w:rFonts w:ascii="Times New Roman" w:eastAsia="Times New Roman" w:hAnsi="Times New Roman" w:cs="Times New Roman"/>
-        </w:rPr>
-        <w:t xml:space="preserve">will honor its fiduciary duty to its insured and </w:t>
-      </w:r>
-      <w:proofErr w:type="gramStart"/>
-      <w:r>
-        <w:rPr>
-          <w:rFonts w:ascii="Times New Roman" w:eastAsia="Times New Roman" w:hAnsi="Times New Roman" w:cs="Times New Roman"/>
-        </w:rPr>
-        <w:t>proffer</w:t>
-      </w:r>
-      <w:proofErr w:type="gramEnd"/>
-      <w:r>
-        <w:rPr>
-          <w:rFonts w:ascii="Times New Roman" w:eastAsia="Times New Roman" w:hAnsi="Times New Roman" w:cs="Times New Roman"/>
-        </w:rPr>
-        <w:t xml:space="preserve"> the policy limits for the injuries your insured negligently caused our client. </w:t>
+        </w:rPr>
+        <w:t xml:space="preserve">will honor its fiduciary duty to its insured and proffer the policy limits for the injuries your insured negligently caused our client. </w:t>
       </w:r>
     </w:p>
     <w:p>
@@ -6432,21 +6061,14 @@
         <w:rPr>
           <w:rFonts w:ascii="Times New Roman" w:hAnsi="Times New Roman" w:cs="Times New Roman"/>
         </w:rPr>
-        <w:t xml:space="preserve">As I’m sure you’re </w:t>
-      </w:r>
-      <w:proofErr w:type="gramStart"/>
-      <w:r>
-        <w:rPr>
-          <w:rFonts w:ascii="Times New Roman" w:hAnsi="Times New Roman" w:cs="Times New Roman"/>
-        </w:rPr>
-        <w:t>well aware</w:t>
-      </w:r>
-      <w:proofErr w:type="gramEnd"/>
-      <w:r>
-        <w:rPr>
-          <w:rFonts w:ascii="Times New Roman" w:hAnsi="Times New Roman" w:cs="Times New Roman"/>
-        </w:rPr>
-        <w:t xml:space="preserve">, an insurer has a duty to communicate this demand to your insured and keep your insured informed about the status of settlement negotiations. California case authority is clear that the failure of an insurer to communicate settlement offers to their insured is in and of itself actionable bad faith. </w:t>
+        <w:t xml:space="preserve">As I’m sure you’re well aware, an insurer has a duty to communicate this demand to your insured and keep your insured informed about the status of settlement negotiations. California case authority is </w:t>
+      </w:r>
+      <w:r>
+        <w:rPr>
+          <w:rFonts w:ascii="Times New Roman" w:hAnsi="Times New Roman" w:cs="Times New Roman"/>
+        </w:rPr>
+        <w:lastRenderedPageBreak/>
+        <w:t xml:space="preserve">clear that the failure of an insurer to communicate settlement offers to their insured is in and of itself actionable bad faith. </w:t>
       </w:r>
     </w:p>
     <w:p>
@@ -6476,7 +6098,6 @@
         <w:rPr>
           <w:rFonts w:ascii="Times New Roman" w:hAnsi="Times New Roman" w:cs="Times New Roman"/>
         </w:rPr>
-        <w:lastRenderedPageBreak/>
         <w:t>Where the insurer knows there is a risk</w:t>
       </w:r>
       <w:r>
@@ -7098,21 +6719,7 @@
         <w:rPr>
           <w:rFonts w:ascii="Times New Roman" w:hAnsi="Times New Roman" w:cs="Times New Roman"/>
         </w:rPr>
-        <w:t xml:space="preserve">nsurers have a duty to communicate all demands </w:t>
-      </w:r>
-      <w:proofErr w:type="gramStart"/>
-      <w:r>
-        <w:rPr>
-          <w:rFonts w:ascii="Times New Roman" w:hAnsi="Times New Roman" w:cs="Times New Roman"/>
-        </w:rPr>
-        <w:t>in excess of</w:t>
-      </w:r>
-      <w:proofErr w:type="gramEnd"/>
-      <w:r>
-        <w:rPr>
-          <w:rFonts w:ascii="Times New Roman" w:hAnsi="Times New Roman" w:cs="Times New Roman"/>
-        </w:rPr>
-        <w:t xml:space="preserve"> policy limits.</w:t>
+        <w:t>nsurers have a duty to communicate all demands in excess of policy limits.</w:t>
       </w:r>
       <w:r>
         <w:rPr>
@@ -7186,21 +6793,7 @@
         <w:rPr>
           <w:rFonts w:ascii="Times New Roman" w:hAnsi="Times New Roman" w:cs="Times New Roman"/>
         </w:rPr>
-        <w:t xml:space="preserve">It is insufficient for you </w:t>
-      </w:r>
-      <w:proofErr w:type="gramStart"/>
-      <w:r>
-        <w:rPr>
-          <w:rFonts w:ascii="Times New Roman" w:hAnsi="Times New Roman" w:cs="Times New Roman"/>
-        </w:rPr>
-        <w:t>to merely</w:t>
-      </w:r>
-      <w:proofErr w:type="gramEnd"/>
-      <w:r>
-        <w:rPr>
-          <w:rFonts w:ascii="Times New Roman" w:hAnsi="Times New Roman" w:cs="Times New Roman"/>
-        </w:rPr>
-        <w:t xml:space="preserve"> inform your </w:t>
+        <w:t xml:space="preserve">It is insufficient for you to merely inform your </w:t>
       </w:r>
       <w:r>
         <w:rPr>
@@ -7406,31 +6999,99 @@
           <w:b/>
           <w:bCs/>
         </w:rPr>
-        <w:t xml:space="preserve">Therefore, request is </w:t>
-      </w:r>
-      <w:proofErr w:type="gramStart"/>
+        <w:t xml:space="preserve">Therefore, request is separately hereby made to immediately direct and forward copies of this herein Time Sensitive Policy Limit Settlement Demand Offer, and all accompanying exhibits and documents, to the attention of: (1) Any and all </w:t>
+      </w:r>
       <w:r>
         <w:rPr>
           <w:rFonts w:ascii="Times New Roman" w:hAnsi="Times New Roman" w:cs="Times New Roman"/>
           <w:b/>
           <w:bCs/>
-        </w:rPr>
-        <w:t>separately hereby</w:t>
-      </w:r>
-      <w:proofErr w:type="gramEnd"/>
+          <w:highlight w:val="yellow"/>
+        </w:rPr>
+        <w:t>Mercury Insurance Company</w:t>
+      </w:r>
       <w:r>
         <w:rPr>
           <w:rFonts w:ascii="Times New Roman" w:hAnsi="Times New Roman" w:cs="Times New Roman"/>
           <w:b/>
           <w:bCs/>
         </w:rPr>
-        <w:t xml:space="preserve"> made to immediately direct and forward copies of this herein Time Sensitive Policy Limit Settlement Demand Offer, and all accompanying exhibits and documents, to the attention of: (1) Any and all </w:t>
+        <w:t xml:space="preserve"> </w:t>
       </w:r>
       <w:r>
         <w:rPr>
           <w:rFonts w:ascii="Times New Roman" w:hAnsi="Times New Roman" w:cs="Times New Roman"/>
           <w:b/>
           <w:bCs/>
+        </w:rPr>
+        <w:t>decision</w:t>
+      </w:r>
+      <w:r>
+        <w:rPr>
+          <w:rFonts w:ascii="Times New Roman" w:hAnsi="Times New Roman" w:cs="Times New Roman"/>
+          <w:b/>
+          <w:bCs/>
+        </w:rPr>
+        <w:t xml:space="preserve"> makers; and (2) Your insured, </w:t>
+      </w:r>
+      <w:r>
+        <w:rPr>
+          <w:rFonts w:ascii="Times New Roman" w:hAnsi="Times New Roman" w:cs="Times New Roman"/>
+          <w:b/>
+          <w:bCs/>
+          <w:highlight w:val="yellow"/>
+        </w:rPr>
+        <w:t>Mrs. Rodney Blowers</w:t>
+      </w:r>
+      <w:r>
+        <w:rPr>
+          <w:rFonts w:ascii="Times New Roman" w:hAnsi="Times New Roman" w:cs="Times New Roman"/>
+          <w:b/>
+          <w:bCs/>
+        </w:rPr>
+        <w:t xml:space="preserve">; and (3) Your insured’s private counsel and/or attorneys. </w:t>
+      </w:r>
+    </w:p>
+    <w:p>
+      <w:pPr>
+        <w:tabs>
+          <w:tab w:val="left" w:pos="540"/>
+        </w:tabs>
+        <w:ind w:left="547"/>
+        <w:jc w:val="both"/>
+        <w:rPr>
+          <w:rFonts w:ascii="Times New Roman" w:hAnsi="Times New Roman" w:cs="Times New Roman"/>
+          <w:b/>
+          <w:bCs/>
+        </w:rPr>
+      </w:pPr>
+    </w:p>
+    <w:p>
+      <w:pPr>
+        <w:tabs>
+          <w:tab w:val="left" w:pos="540"/>
+        </w:tabs>
+        <w:ind w:left="547"/>
+        <w:jc w:val="both"/>
+        <w:rPr>
+          <w:rFonts w:ascii="Times New Roman" w:hAnsi="Times New Roman" w:cs="Times New Roman"/>
+          <w:b/>
+          <w:bCs/>
+        </w:rPr>
+      </w:pPr>
+      <w:r>
+        <w:rPr>
+          <w:rFonts w:ascii="Times New Roman" w:hAnsi="Times New Roman" w:cs="Times New Roman"/>
+          <w:b/>
+          <w:bCs/>
+        </w:rPr>
+        <w:t xml:space="preserve">Additionally, a further separate request is hereby made that </w:t>
+      </w:r>
+      <w:r>
+        <w:rPr>
+          <w:rFonts w:ascii="Times New Roman" w:hAnsi="Times New Roman" w:cs="Times New Roman"/>
+          <w:b/>
+          <w:bCs/>
           <w:highlight w:val="yellow"/>
         </w:rPr>
         <w:t>Mercury Insurance Company</w:t>
@@ -7449,7 +7110,7 @@
           <w:b/>
           <w:bCs/>
         </w:rPr>
-        <w:t>decision</w:t>
+        <w:t>provide</w:t>
       </w:r>
       <w:r>
         <w:rPr>
@@ -7457,111 +7118,7 @@
           <w:b/>
           <w:bCs/>
         </w:rPr>
-        <w:t xml:space="preserve"> makers; and (2) Your insured, </w:t>
-      </w:r>
-      <w:r>
-        <w:rPr>
-          <w:rFonts w:ascii="Times New Roman" w:hAnsi="Times New Roman" w:cs="Times New Roman"/>
-          <w:b/>
-          <w:bCs/>
-          <w:highlight w:val="yellow"/>
-        </w:rPr>
-        <w:t>Mr. Rodney Blowers</w:t>
-      </w:r>
-      <w:r>
-        <w:rPr>
-          <w:rFonts w:ascii="Times New Roman" w:hAnsi="Times New Roman" w:cs="Times New Roman"/>
-          <w:b/>
-          <w:bCs/>
-        </w:rPr>
-        <w:t xml:space="preserve">; and (3) Your insured’s private counsel and/or attorneys. </w:t>
-      </w:r>
-    </w:p>
-    <w:p>
-      <w:pPr>
-        <w:tabs>
-          <w:tab w:val="left" w:pos="540"/>
-        </w:tabs>
-        <w:ind w:left="547"/>
-        <w:jc w:val="both"/>
-        <w:rPr>
-          <w:rFonts w:ascii="Times New Roman" w:hAnsi="Times New Roman" w:cs="Times New Roman"/>
-          <w:b/>
-          <w:bCs/>
-        </w:rPr>
-      </w:pPr>
-    </w:p>
-    <w:p>
-      <w:pPr>
-        <w:tabs>
-          <w:tab w:val="left" w:pos="540"/>
-        </w:tabs>
-        <w:ind w:left="547"/>
-        <w:jc w:val="both"/>
-        <w:rPr>
-          <w:rFonts w:ascii="Times New Roman" w:hAnsi="Times New Roman" w:cs="Times New Roman"/>
-          <w:b/>
-          <w:bCs/>
-        </w:rPr>
-      </w:pPr>
-      <w:r>
-        <w:rPr>
-          <w:rFonts w:ascii="Times New Roman" w:hAnsi="Times New Roman" w:cs="Times New Roman"/>
-          <w:b/>
-          <w:bCs/>
-        </w:rPr>
-        <w:t xml:space="preserve">Additionally, a further separate request is hereby made that </w:t>
-      </w:r>
-      <w:r>
-        <w:rPr>
-          <w:rFonts w:ascii="Times New Roman" w:hAnsi="Times New Roman" w:cs="Times New Roman"/>
-          <w:b/>
-          <w:bCs/>
-          <w:highlight w:val="yellow"/>
-        </w:rPr>
-        <w:t>Mercury Insurance Company</w:t>
-      </w:r>
-      <w:r>
-        <w:rPr>
-          <w:rFonts w:ascii="Times New Roman" w:hAnsi="Times New Roman" w:cs="Times New Roman"/>
-          <w:b/>
-          <w:bCs/>
-        </w:rPr>
-        <w:t xml:space="preserve"> </w:t>
-      </w:r>
-      <w:r>
-        <w:rPr>
-          <w:rFonts w:ascii="Times New Roman" w:hAnsi="Times New Roman" w:cs="Times New Roman"/>
-          <w:b/>
-          <w:bCs/>
-        </w:rPr>
-        <w:t>provide</w:t>
-      </w:r>
-      <w:r>
-        <w:rPr>
-          <w:rFonts w:ascii="Times New Roman" w:hAnsi="Times New Roman" w:cs="Times New Roman"/>
-          <w:b/>
-          <w:bCs/>
-        </w:rPr>
-        <w:t xml:space="preserve"> this office with </w:t>
-      </w:r>
-      <w:proofErr w:type="gramStart"/>
-      <w:r>
-        <w:rPr>
-          <w:rFonts w:ascii="Times New Roman" w:hAnsi="Times New Roman" w:cs="Times New Roman"/>
-          <w:b/>
-          <w:bCs/>
-        </w:rPr>
-        <w:t>the contact</w:t>
-      </w:r>
-      <w:proofErr w:type="gramEnd"/>
-      <w:r>
-        <w:rPr>
-          <w:rFonts w:ascii="Times New Roman" w:hAnsi="Times New Roman" w:cs="Times New Roman"/>
-          <w:b/>
-          <w:bCs/>
-        </w:rPr>
-        <w:t xml:space="preserve"> information for your insured’s private counsel or attorneys.  </w:t>
+        <w:t xml:space="preserve"> this office with the contact information for your insured’s private counsel or attorneys.  </w:t>
       </w:r>
     </w:p>
     <w:p>
@@ -7657,21 +7214,8 @@
         <w:rPr>
           <w:rFonts w:ascii="Times New Roman" w:hAnsi="Times New Roman" w:cs="Times New Roman"/>
         </w:rPr>
-        <w:t xml:space="preserve">As previously mentioned, we hope that this matter can </w:t>
-      </w:r>
-      <w:proofErr w:type="gramStart"/>
-      <w:r>
-        <w:rPr>
-          <w:rFonts w:ascii="Times New Roman" w:hAnsi="Times New Roman" w:cs="Times New Roman"/>
-        </w:rPr>
-        <w:t>resolve</w:t>
-      </w:r>
-      <w:proofErr w:type="gramEnd"/>
-      <w:r>
-        <w:rPr>
-          <w:rFonts w:ascii="Times New Roman" w:hAnsi="Times New Roman" w:cs="Times New Roman"/>
-        </w:rPr>
-        <w:t xml:space="preserve"> without the necessity of expensive and protracted litigation. If you consider this settlement offer carefully, you will realize that this offer is not only fair, but equitable for all parties involved.</w:t>
+        <w:lastRenderedPageBreak/>
+        <w:t>As previously mentioned, we hope that this matter can resolve without the necessity of expensive and protracted litigation. If you consider this settlement offer carefully, you will realize that this offer is not only fair, but equitable for all parties involved.</w:t>
       </w:r>
     </w:p>
     <w:p>
@@ -7826,42 +7370,7 @@
         <w:rPr>
           <w:rFonts w:ascii="Times New Roman" w:hAnsi="Times New Roman" w:cs="Times New Roman"/>
         </w:rPr>
-        <w:t xml:space="preserve"> and information that you will need </w:t>
-      </w:r>
-      <w:proofErr w:type="gramStart"/>
-      <w:r>
-        <w:rPr>
-          <w:rFonts w:ascii="Times New Roman" w:hAnsi="Times New Roman" w:cs="Times New Roman"/>
-        </w:rPr>
-        <w:t>for evaluating</w:t>
-      </w:r>
-      <w:proofErr w:type="gramEnd"/>
-      <w:r>
-        <w:rPr>
-          <w:rFonts w:ascii="Times New Roman" w:hAnsi="Times New Roman" w:cs="Times New Roman"/>
-        </w:rPr>
-        <w:t xml:space="preserve"> this claim. The </w:t>
-      </w:r>
-      <w:proofErr w:type="gramStart"/>
-      <w:r>
-        <w:rPr>
-          <w:rFonts w:ascii="Times New Roman" w:hAnsi="Times New Roman" w:cs="Times New Roman"/>
-        </w:rPr>
-        <w:t>damages</w:t>
-      </w:r>
-      <w:proofErr w:type="gramEnd"/>
-      <w:r>
-        <w:rPr>
-          <w:rFonts w:ascii="Times New Roman" w:hAnsi="Times New Roman" w:cs="Times New Roman"/>
-        </w:rPr>
-        <w:t xml:space="preserve"> sustained by our client far exceed the policy carried by your insured. We therefore believe that you </w:t>
-      </w:r>
-      <w:proofErr w:type="gramStart"/>
-      <w:r>
-        <w:rPr>
-          <w:rFonts w:ascii="Times New Roman" w:hAnsi="Times New Roman" w:cs="Times New Roman"/>
-        </w:rPr>
-        <w:t xml:space="preserve">are </w:t>
+        <w:t xml:space="preserve"> and information that you will need for evaluating this claim. The damages sustained by our client far exceed the policy carried by your insured. We therefore believe that you are </w:t>
       </w:r>
       <w:r>
         <w:rPr>
@@ -7873,28 +7382,7 @@
         <w:rPr>
           <w:rFonts w:ascii="Times New Roman" w:hAnsi="Times New Roman" w:cs="Times New Roman"/>
         </w:rPr>
-        <w:t xml:space="preserve"> to</w:t>
-      </w:r>
-      <w:proofErr w:type="gramEnd"/>
-      <w:r>
-        <w:rPr>
-          <w:rFonts w:ascii="Times New Roman" w:hAnsi="Times New Roman" w:cs="Times New Roman"/>
-        </w:rPr>
-        <w:t xml:space="preserve"> act promptly upon this demand and tender the full policy limits </w:t>
-      </w:r>
-      <w:proofErr w:type="gramStart"/>
-      <w:r>
-        <w:rPr>
-          <w:rFonts w:ascii="Times New Roman" w:hAnsi="Times New Roman" w:cs="Times New Roman"/>
-        </w:rPr>
-        <w:t>carried</w:t>
-      </w:r>
-      <w:proofErr w:type="gramEnd"/>
-      <w:r>
-        <w:rPr>
-          <w:rFonts w:ascii="Times New Roman" w:hAnsi="Times New Roman" w:cs="Times New Roman"/>
-        </w:rPr>
-        <w:t xml:space="preserve"> by your insured. </w:t>
+        <w:t xml:space="preserve"> to act promptly upon this demand and tender the full policy limits carried by your insured. </w:t>
       </w:r>
     </w:p>
     <w:p>
@@ -8042,21 +7530,7 @@
         <w:rPr>
           <w:rFonts w:ascii="Times New Roman" w:hAnsi="Times New Roman" w:cs="Times New Roman"/>
         </w:rPr>
-        <w:t xml:space="preserve">In the spirit of cooperation and in further attempts to resolve these issues informally and amicably, please feel free </w:t>
-      </w:r>
-      <w:proofErr w:type="gramStart"/>
-      <w:r>
-        <w:rPr>
-          <w:rFonts w:ascii="Times New Roman" w:hAnsi="Times New Roman" w:cs="Times New Roman"/>
-        </w:rPr>
-        <w:t>contact</w:t>
-      </w:r>
-      <w:proofErr w:type="gramEnd"/>
-      <w:r>
-        <w:rPr>
-          <w:rFonts w:ascii="Times New Roman" w:hAnsi="Times New Roman" w:cs="Times New Roman"/>
-        </w:rPr>
-        <w:t xml:space="preserve"> the undersigned upon receipt of this letter so that we may discuss the issues contained herein on or before the expiration of this settlement demand. </w:t>
+        <w:t xml:space="preserve">In the spirit of cooperation and in further attempts to resolve these issues informally and amicably, please feel free contact the undersigned upon receipt of this letter so that we may discuss the issues contained herein on or before the expiration of this settlement demand. </w:t>
       </w:r>
     </w:p>
     <w:p>
@@ -8086,21 +7560,7 @@
         <w:rPr>
           <w:rFonts w:ascii="Times New Roman" w:hAnsi="Times New Roman" w:cs="Times New Roman"/>
         </w:rPr>
-        <w:t xml:space="preserve">Nevertheless, please be advised that our demand to settle the </w:t>
-      </w:r>
-      <w:proofErr w:type="gramStart"/>
-      <w:r>
-        <w:rPr>
-          <w:rFonts w:ascii="Times New Roman" w:hAnsi="Times New Roman" w:cs="Times New Roman"/>
-        </w:rPr>
-        <w:t>above referenced</w:t>
-      </w:r>
-      <w:proofErr w:type="gramEnd"/>
-      <w:r>
-        <w:rPr>
-          <w:rFonts w:ascii="Times New Roman" w:hAnsi="Times New Roman" w:cs="Times New Roman"/>
-        </w:rPr>
-        <w:t xml:space="preserve"> claim will expire after </w:t>
+        <w:t xml:space="preserve">Nevertheless, please be advised that our demand to settle the above referenced claim will expire after </w:t>
       </w:r>
       <w:r>
         <w:rPr>
@@ -8117,7 +7577,7 @@
           <w:highlight w:val="yellow"/>
           <w:u w:val="single"/>
         </w:rPr>
-        <w:t>DECEMBER 26, 2024</w:t>
+        <w:t>DECEMBER 27, 2024</w:t>
       </w:r>
       <w:r>
         <w:rPr>
@@ -8299,7 +7759,6 @@
         <w:rPr>
           <w:rFonts w:ascii="Times New Roman" w:hAnsi="Times New Roman"/>
         </w:rPr>
-        <w:lastRenderedPageBreak/>
         <w:tab/>
       </w:r>
       <w:r>
@@ -8602,7 +8061,7 @@
 </file>
 
 <file path=word/endnotes.xml><?xml version="1.0" encoding="utf-8"?>
-<w:endnotes xmlns:wpc="http://schemas.microsoft.com/office/word/2010/wordprocessingCanvas" xmlns:cx="http://schemas.microsoft.com/office/drawing/2014/chartex" xmlns:cx1="http://schemas.microsoft.com/office/drawing/2015/9/8/chartex" xmlns:cx2="http://schemas.microsoft.com/office/drawing/2015/10/21/chartex" xmlns:cx3="http://schemas.microsoft.com/office/drawing/2016/5/9/chartex" xmlns:cx4="http://schemas.microsoft.com/office/drawing/2016/5/10/chartex" xmlns:cx5="http://schemas.microsoft.com/office/drawing/2016/5/11/chartex" xmlns:cx6="http://schemas.microsoft.com/office/drawing/2016/5/12/chartex" xmlns:cx7="http://schemas.microsoft.com/office/drawing/2016/5/13/chartex" xmlns:cx8="http://schemas.microsoft.com/office/drawing/2016/5/14/chartex" xmlns:mc="http://schemas.openxmlformats.org/markup-compatibility/2006" xmlns:aink="http://schemas.microsoft.com/office/drawing/2016/ink" xmlns:am3d="http://schemas.microsoft.com/office/drawing/2017/model3d" xmlns:o="urn:schemas-microsoft-com:office:office" xmlns:oel="http://schemas.microsoft.com/office/2019/extlst" xmlns:r="http://schemas.openxmlformats.org/officeDocument/2006/relationships" xmlns:m="http://schemas.openxmlformats.org/officeDocument/2006/math" xmlns:v="urn:schemas-microsoft-com:vml" xmlns:wp14="http://schemas.microsoft.com/office/word/2010/wordprocessingDrawing" xmlns:wp="http://schemas.openxmlformats.org/drawingml/2006/wordprocessingDrawing" xmlns:w10="urn:schemas-microsoft-com:office:word" xmlns:w="http://schemas.openxmlformats.org/wordprocessingml/2006/main" xmlns:w14="http://schemas.microsoft.com/office/word/2010/wordml" xmlns:w15="http://schemas.microsoft.com/office/word/2012/wordml" xmlns:w16cex="http://schemas.microsoft.com/office/word/2018/wordml/cex" xmlns:w16cid="http://schemas.microsoft.com/office/word/2016/wordml/cid" xmlns:w16="http://schemas.microsoft.com/office/word/2018/wordml" xmlns:w16du="http://schemas.microsoft.com/office/word/2023/wordml/word16du" xmlns:w16sdtdh="http://schemas.microsoft.com/office/word/2020/wordml/sdtdatahash" xmlns:w16se="http://schemas.microsoft.com/office/word/2015/wordml/symex" xmlns:wpg="http://schemas.microsoft.com/office/word/2010/wordprocessingGroup" xmlns:wpi="http://schemas.microsoft.com/office/word/2010/wordprocessingInk" xmlns:wne="http://schemas.microsoft.com/office/word/2006/wordml" xmlns:wps="http://schemas.microsoft.com/office/word/2010/wordprocessingShape" mc:Ignorable="w14 w15 w16se w16cid w16 w16cex w16sdtdh w16du wp14">
+<w:endnotes xmlns:wpc="http://schemas.microsoft.com/office/word/2010/wordprocessingCanvas" xmlns:cx="http://schemas.microsoft.com/office/drawing/2014/chartex" xmlns:cx1="http://schemas.microsoft.com/office/drawing/2015/9/8/chartex" xmlns:cx2="http://schemas.microsoft.com/office/drawing/2015/10/21/chartex" xmlns:cx3="http://schemas.microsoft.com/office/drawing/2016/5/9/chartex" xmlns:cx4="http://schemas.microsoft.com/office/drawing/2016/5/10/chartex" xmlns:cx5="http://schemas.microsoft.com/office/drawing/2016/5/11/chartex" xmlns:cx6="http://schemas.microsoft.com/office/drawing/2016/5/12/chartex" xmlns:cx7="http://schemas.microsoft.com/office/drawing/2016/5/13/chartex" xmlns:cx8="http://schemas.microsoft.com/office/drawing/2016/5/14/chartex" xmlns:mc="http://schemas.openxmlformats.org/markup-compatibility/2006" xmlns:aink="http://schemas.microsoft.com/office/drawing/2016/ink" xmlns:am3d="http://schemas.microsoft.com/office/drawing/2017/model3d" xmlns:o="urn:schemas-microsoft-com:office:office" xmlns:oel="http://schemas.microsoft.com/office/2019/extlst" xmlns:r="http://schemas.openxmlformats.org/officeDocument/2006/relationships" xmlns:m="http://schemas.openxmlformats.org/officeDocument/2006/math" xmlns:v="urn:schemas-microsoft-com:vml" xmlns:wp14="http://schemas.microsoft.com/office/word/2010/wordprocessingDrawing" xmlns:wp="http://schemas.openxmlformats.org/drawingml/2006/wordprocessingDrawing" xmlns:w10="urn:schemas-microsoft-com:office:word" xmlns:w="http://schemas.openxmlformats.org/wordprocessingml/2006/main" xmlns:w14="http://schemas.microsoft.com/office/word/2010/wordml" xmlns:w15="http://schemas.microsoft.com/office/word/2012/wordml" xmlns:w16cex="http://schemas.microsoft.com/office/word/2018/wordml/cex" xmlns:w16cid="http://schemas.microsoft.com/office/word/2016/wordml/cid" xmlns:w16="http://schemas.microsoft.com/office/word/2018/wordml" xmlns:w16sdtdh="http://schemas.microsoft.com/office/word/2020/wordml/sdtdatahash" xmlns:w16se="http://schemas.microsoft.com/office/word/2015/wordml/symex" xmlns:wpg="http://schemas.microsoft.com/office/word/2010/wordprocessingGroup" xmlns:wpi="http://schemas.microsoft.com/office/word/2010/wordprocessingInk" xmlns:wne="http://schemas.microsoft.com/office/word/2006/wordml" xmlns:wps="http://schemas.microsoft.com/office/word/2010/wordprocessingShape" mc:Ignorable="w14 w15 w16se w16cid w16 w16cex w16sdtdh wp14">
   <w:endnote w:type="separator" w:id="-1">
     <w:p>
       <w:r>
@@ -8621,7 +8080,7 @@
 </file>
 
 <file path=word/footer1.xml><?xml version="1.0" encoding="utf-8"?>
-<w:ftr xmlns:wpc="http://schemas.microsoft.com/office/word/2010/wordprocessingCanvas" xmlns:cx="http://schemas.microsoft.com/office/drawing/2014/chartex" xmlns:cx1="http://schemas.microsoft.com/office/drawing/2015/9/8/chartex" xmlns:cx2="http://schemas.microsoft.com/office/drawing/2015/10/21/chartex" xmlns:cx3="http://schemas.microsoft.com/office/drawing/2016/5/9/chartex" xmlns:cx4="http://schemas.microsoft.com/office/drawing/2016/5/10/chartex" xmlns:cx5="http://schemas.microsoft.com/office/drawing/2016/5/11/chartex" xmlns:cx6="http://schemas.microsoft.com/office/drawing/2016/5/12/chartex" xmlns:cx7="http://schemas.microsoft.com/office/drawing/2016/5/13/chartex" xmlns:cx8="http://schemas.microsoft.com/office/drawing/2016/5/14/chartex" xmlns:mc="http://schemas.openxmlformats.org/markup-compatibility/2006" xmlns:aink="http://schemas.microsoft.com/office/drawing/2016/ink" xmlns:am3d="http://schemas.microsoft.com/office/drawing/2017/model3d" xmlns:o="urn:schemas-microsoft-com:office:office" xmlns:oel="http://schemas.microsoft.com/office/2019/extlst" xmlns:r="http://schemas.openxmlformats.org/officeDocument/2006/relationships" xmlns:m="http://schemas.openxmlformats.org/officeDocument/2006/math" xmlns:v="urn:schemas-microsoft-com:vml" xmlns:wp14="http://schemas.microsoft.com/office/word/2010/wordprocessingDrawing" xmlns:wp="http://schemas.openxmlformats.org/drawingml/2006/wordprocessingDrawing" xmlns:w10="urn:schemas-microsoft-com:office:word" xmlns:w="http://schemas.openxmlformats.org/wordprocessingml/2006/main" xmlns:w14="http://schemas.microsoft.com/office/word/2010/wordml" xmlns:w15="http://schemas.microsoft.com/office/word/2012/wordml" xmlns:w16cex="http://schemas.microsoft.com/office/word/2018/wordml/cex" xmlns:w16cid="http://schemas.microsoft.com/office/word/2016/wordml/cid" xmlns:w16="http://schemas.microsoft.com/office/word/2018/wordml" xmlns:w16du="http://schemas.microsoft.com/office/word/2023/wordml/word16du" xmlns:w16sdtdh="http://schemas.microsoft.com/office/word/2020/wordml/sdtdatahash" xmlns:w16se="http://schemas.microsoft.com/office/word/2015/wordml/symex" xmlns:wpg="http://schemas.microsoft.com/office/word/2010/wordprocessingGroup" xmlns:wpi="http://schemas.microsoft.com/office/word/2010/wordprocessingInk" xmlns:wne="http://schemas.microsoft.com/office/word/2006/wordml" xmlns:wps="http://schemas.microsoft.com/office/word/2010/wordprocessingShape" mc:Ignorable="w14 w15 w16se w16cid w16 w16cex w16sdtdh w16du wp14">
+<w:ftr xmlns:wpc="http://schemas.microsoft.com/office/word/2010/wordprocessingCanvas" xmlns:cx="http://schemas.microsoft.com/office/drawing/2014/chartex" xmlns:cx1="http://schemas.microsoft.com/office/drawing/2015/9/8/chartex" xmlns:cx2="http://schemas.microsoft.com/office/drawing/2015/10/21/chartex" xmlns:cx3="http://schemas.microsoft.com/office/drawing/2016/5/9/chartex" xmlns:cx4="http://schemas.microsoft.com/office/drawing/2016/5/10/chartex" xmlns:cx5="http://schemas.microsoft.com/office/drawing/2016/5/11/chartex" xmlns:cx6="http://schemas.microsoft.com/office/drawing/2016/5/12/chartex" xmlns:cx7="http://schemas.microsoft.com/office/drawing/2016/5/13/chartex" xmlns:cx8="http://schemas.microsoft.com/office/drawing/2016/5/14/chartex" xmlns:mc="http://schemas.openxmlformats.org/markup-compatibility/2006" xmlns:aink="http://schemas.microsoft.com/office/drawing/2016/ink" xmlns:am3d="http://schemas.microsoft.com/office/drawing/2017/model3d" xmlns:o="urn:schemas-microsoft-com:office:office" xmlns:oel="http://schemas.microsoft.com/office/2019/extlst" xmlns:r="http://schemas.openxmlformats.org/officeDocument/2006/relationships" xmlns:m="http://schemas.openxmlformats.org/officeDocument/2006/math" xmlns:v="urn:schemas-microsoft-com:vml" xmlns:wp14="http://schemas.microsoft.com/office/word/2010/wordprocessingDrawing" xmlns:wp="http://schemas.openxmlformats.org/drawingml/2006/wordprocessingDrawing" xmlns:w10="urn:schemas-microsoft-com:office:word" xmlns:w="http://schemas.openxmlformats.org/wordprocessingml/2006/main" xmlns:w14="http://schemas.microsoft.com/office/word/2010/wordml" xmlns:w15="http://schemas.microsoft.com/office/word/2012/wordml" xmlns:w16cex="http://schemas.microsoft.com/office/word/2018/wordml/cex" xmlns:w16cid="http://schemas.microsoft.com/office/word/2016/wordml/cid" xmlns:w16="http://schemas.microsoft.com/office/word/2018/wordml" xmlns:w16sdtdh="http://schemas.microsoft.com/office/word/2020/wordml/sdtdatahash" xmlns:w16se="http://schemas.microsoft.com/office/word/2015/wordml/symex" xmlns:wpg="http://schemas.microsoft.com/office/word/2010/wordprocessingGroup" xmlns:wpi="http://schemas.microsoft.com/office/word/2010/wordprocessingInk" xmlns:wne="http://schemas.microsoft.com/office/word/2006/wordml" xmlns:wps="http://schemas.microsoft.com/office/word/2010/wordprocessingShape" mc:Ignorable="w14 w15 w16se w16cid w16 w16cex w16sdtdh wp14">
   <w:p>
     <w:pPr>
       <w:jc w:val="right"/>
@@ -8636,7 +8095,7 @@
 </file>
 
 <file path=word/footnotes.xml><?xml version="1.0" encoding="utf-8"?>
-<w:footnotes xmlns:wpc="http://schemas.microsoft.com/office/word/2010/wordprocessingCanvas" xmlns:cx="http://schemas.microsoft.com/office/drawing/2014/chartex" xmlns:cx1="http://schemas.microsoft.com/office/drawing/2015/9/8/chartex" xmlns:cx2="http://schemas.microsoft.com/office/drawing/2015/10/21/chartex" xmlns:cx3="http://schemas.microsoft.com/office/drawing/2016/5/9/chartex" xmlns:cx4="http://schemas.microsoft.com/office/drawing/2016/5/10/chartex" xmlns:cx5="http://schemas.microsoft.com/office/drawing/2016/5/11/chartex" xmlns:cx6="http://schemas.microsoft.com/office/drawing/2016/5/12/chartex" xmlns:cx7="http://schemas.microsoft.com/office/drawing/2016/5/13/chartex" xmlns:cx8="http://schemas.microsoft.com/office/drawing/2016/5/14/chartex" xmlns:mc="http://schemas.openxmlformats.org/markup-compatibility/2006" xmlns:aink="http://schemas.microsoft.com/office/drawing/2016/ink" xmlns:am3d="http://schemas.microsoft.com/office/drawing/2017/model3d" xmlns:o="urn:schemas-microsoft-com:office:office" xmlns:oel="http://schemas.microsoft.com/office/2019/extlst" xmlns:r="http://schemas.openxmlformats.org/officeDocument/2006/relationships" xmlns:m="http://schemas.openxmlformats.org/officeDocument/2006/math" xmlns:v="urn:schemas-microsoft-com:vml" xmlns:wp14="http://schemas.microsoft.com/office/word/2010/wordprocessingDrawing" xmlns:wp="http://schemas.openxmlformats.org/drawingml/2006/wordprocessingDrawing" xmlns:w10="urn:schemas-microsoft-com:office:word" xmlns:w="http://schemas.openxmlformats.org/wordprocessingml/2006/main" xmlns:w14="http://schemas.microsoft.com/office/word/2010/wordml" xmlns:w15="http://schemas.microsoft.com/office/word/2012/wordml" xmlns:w16cex="http://schemas.microsoft.com/office/word/2018/wordml/cex" xmlns:w16cid="http://schemas.microsoft.com/office/word/2016/wordml/cid" xmlns:w16="http://schemas.microsoft.com/office/word/2018/wordml" xmlns:w16du="http://schemas.microsoft.com/office/word/2023/wordml/word16du" xmlns:w16sdtdh="http://schemas.microsoft.com/office/word/2020/wordml/sdtdatahash" xmlns:w16se="http://schemas.microsoft.com/office/word/2015/wordml/symex" xmlns:wpg="http://schemas.microsoft.com/office/word/2010/wordprocessingGroup" xmlns:wpi="http://schemas.microsoft.com/office/word/2010/wordprocessingInk" xmlns:wne="http://schemas.microsoft.com/office/word/2006/wordml" xmlns:wps="http://schemas.microsoft.com/office/word/2010/wordprocessingShape" mc:Ignorable="w14 w15 w16se w16cid w16 w16cex w16sdtdh w16du wp14">
+<w:footnotes xmlns:wpc="http://schemas.microsoft.com/office/word/2010/wordprocessingCanvas" xmlns:cx="http://schemas.microsoft.com/office/drawing/2014/chartex" xmlns:cx1="http://schemas.microsoft.com/office/drawing/2015/9/8/chartex" xmlns:cx2="http://schemas.microsoft.com/office/drawing/2015/10/21/chartex" xmlns:cx3="http://schemas.microsoft.com/office/drawing/2016/5/9/chartex" xmlns:cx4="http://schemas.microsoft.com/office/drawing/2016/5/10/chartex" xmlns:cx5="http://schemas.microsoft.com/office/drawing/2016/5/11/chartex" xmlns:cx6="http://schemas.microsoft.com/office/drawing/2016/5/12/chartex" xmlns:cx7="http://schemas.microsoft.com/office/drawing/2016/5/13/chartex" xmlns:cx8="http://schemas.microsoft.com/office/drawing/2016/5/14/chartex" xmlns:mc="http://schemas.openxmlformats.org/markup-compatibility/2006" xmlns:aink="http://schemas.microsoft.com/office/drawing/2016/ink" xmlns:am3d="http://schemas.microsoft.com/office/drawing/2017/model3d" xmlns:o="urn:schemas-microsoft-com:office:office" xmlns:oel="http://schemas.microsoft.com/office/2019/extlst" xmlns:r="http://schemas.openxmlformats.org/officeDocument/2006/relationships" xmlns:m="http://schemas.openxmlformats.org/officeDocument/2006/math" xmlns:v="urn:schemas-microsoft-com:vml" xmlns:wp14="http://schemas.microsoft.com/office/word/2010/wordprocessingDrawing" xmlns:wp="http://schemas.openxmlformats.org/drawingml/2006/wordprocessingDrawing" xmlns:w10="urn:schemas-microsoft-com:office:word" xmlns:w="http://schemas.openxmlformats.org/wordprocessingml/2006/main" xmlns:w14="http://schemas.microsoft.com/office/word/2010/wordml" xmlns:w15="http://schemas.microsoft.com/office/word/2012/wordml" xmlns:w16cex="http://schemas.microsoft.com/office/word/2018/wordml/cex" xmlns:w16cid="http://schemas.microsoft.com/office/word/2016/wordml/cid" xmlns:w16="http://schemas.microsoft.com/office/word/2018/wordml" xmlns:w16sdtdh="http://schemas.microsoft.com/office/word/2020/wordml/sdtdatahash" xmlns:w16se="http://schemas.microsoft.com/office/word/2015/wordml/symex" xmlns:wpg="http://schemas.microsoft.com/office/word/2010/wordprocessingGroup" xmlns:wpi="http://schemas.microsoft.com/office/word/2010/wordprocessingInk" xmlns:wne="http://schemas.microsoft.com/office/word/2006/wordml" xmlns:wps="http://schemas.microsoft.com/office/word/2010/wordprocessingShape" mc:Ignorable="w14 w15 w16se w16cid w16 w16cex w16sdtdh wp14">
   <w:footnote w:type="separator" w:id="-1">
     <w:p>
       <w:r>
@@ -8713,7 +8172,7 @@
 </file>
 
 <file path=word/header1.xml><?xml version="1.0" encoding="utf-8"?>
-<w:hdr xmlns:wpc="http://schemas.microsoft.com/office/word/2010/wordprocessingCanvas" xmlns:cx="http://schemas.microsoft.com/office/drawing/2014/chartex" xmlns:cx1="http://schemas.microsoft.com/office/drawing/2015/9/8/chartex" xmlns:cx2="http://schemas.microsoft.com/office/drawing/2015/10/21/chartex" xmlns:cx3="http://schemas.microsoft.com/office/drawing/2016/5/9/chartex" xmlns:cx4="http://schemas.microsoft.com/office/drawing/2016/5/10/chartex" xmlns:cx5="http://schemas.microsoft.com/office/drawing/2016/5/11/chartex" xmlns:cx6="http://schemas.microsoft.com/office/drawing/2016/5/12/chartex" xmlns:cx7="http://schemas.microsoft.com/office/drawing/2016/5/13/chartex" xmlns:cx8="http://schemas.microsoft.com/office/drawing/2016/5/14/chartex" xmlns:mc="http://schemas.openxmlformats.org/markup-compatibility/2006" xmlns:aink="http://schemas.microsoft.com/office/drawing/2016/ink" xmlns:am3d="http://schemas.microsoft.com/office/drawing/2017/model3d" xmlns:o="urn:schemas-microsoft-com:office:office" xmlns:oel="http://schemas.microsoft.com/office/2019/extlst" xmlns:r="http://schemas.openxmlformats.org/officeDocument/2006/relationships" xmlns:m="http://schemas.openxmlformats.org/officeDocument/2006/math" xmlns:v="urn:schemas-microsoft-com:vml" xmlns:wp14="http://schemas.microsoft.com/office/word/2010/wordprocessingDrawing" xmlns:wp="http://schemas.openxmlformats.org/drawingml/2006/wordprocessingDrawing" xmlns:w10="urn:schemas-microsoft-com:office:word" xmlns:w="http://schemas.openxmlformats.org/wordprocessingml/2006/main" xmlns:w14="http://schemas.microsoft.com/office/word/2010/wordml" xmlns:w15="http://schemas.microsoft.com/office/word/2012/wordml" xmlns:w16cex="http://schemas.microsoft.com/office/word/2018/wordml/cex" xmlns:w16cid="http://schemas.microsoft.com/office/word/2016/wordml/cid" xmlns:w16="http://schemas.microsoft.com/office/word/2018/wordml" xmlns:w16du="http://schemas.microsoft.com/office/word/2023/wordml/word16du" xmlns:w16sdtdh="http://schemas.microsoft.com/office/word/2020/wordml/sdtdatahash" xmlns:w16se="http://schemas.microsoft.com/office/word/2015/wordml/symex" xmlns:wpg="http://schemas.microsoft.com/office/word/2010/wordprocessingGroup" xmlns:wpi="http://schemas.microsoft.com/office/word/2010/wordprocessingInk" xmlns:wne="http://schemas.microsoft.com/office/word/2006/wordml" xmlns:wps="http://schemas.microsoft.com/office/word/2010/wordprocessingShape" mc:Ignorable="w14 w15 w16se w16cid w16 w16cex w16sdtdh w16du wp14">
+<w:hdr xmlns:wpc="http://schemas.microsoft.com/office/word/2010/wordprocessingCanvas" xmlns:cx="http://schemas.microsoft.com/office/drawing/2014/chartex" xmlns:cx1="http://schemas.microsoft.com/office/drawing/2015/9/8/chartex" xmlns:cx2="http://schemas.microsoft.com/office/drawing/2015/10/21/chartex" xmlns:cx3="http://schemas.microsoft.com/office/drawing/2016/5/9/chartex" xmlns:cx4="http://schemas.microsoft.com/office/drawing/2016/5/10/chartex" xmlns:cx5="http://schemas.microsoft.com/office/drawing/2016/5/11/chartex" xmlns:cx6="http://schemas.microsoft.com/office/drawing/2016/5/12/chartex" xmlns:cx7="http://schemas.microsoft.com/office/drawing/2016/5/13/chartex" xmlns:cx8="http://schemas.microsoft.com/office/drawing/2016/5/14/chartex" xmlns:mc="http://schemas.openxmlformats.org/markup-compatibility/2006" xmlns:aink="http://schemas.microsoft.com/office/drawing/2016/ink" xmlns:am3d="http://schemas.microsoft.com/office/drawing/2017/model3d" xmlns:o="urn:schemas-microsoft-com:office:office" xmlns:oel="http://schemas.microsoft.com/office/2019/extlst" xmlns:r="http://schemas.openxmlformats.org/officeDocument/2006/relationships" xmlns:m="http://schemas.openxmlformats.org/officeDocument/2006/math" xmlns:v="urn:schemas-microsoft-com:vml" xmlns:wp14="http://schemas.microsoft.com/office/word/2010/wordprocessingDrawing" xmlns:wp="http://schemas.openxmlformats.org/drawingml/2006/wordprocessingDrawing" xmlns:w10="urn:schemas-microsoft-com:office:word" xmlns:w="http://schemas.openxmlformats.org/wordprocessingml/2006/main" xmlns:w14="http://schemas.microsoft.com/office/word/2010/wordml" xmlns:w15="http://schemas.microsoft.com/office/word/2012/wordml" xmlns:w16cex="http://schemas.microsoft.com/office/word/2018/wordml/cex" xmlns:w16cid="http://schemas.microsoft.com/office/word/2016/wordml/cid" xmlns:w16="http://schemas.microsoft.com/office/word/2018/wordml" xmlns:w16sdtdh="http://schemas.microsoft.com/office/word/2020/wordml/sdtdatahash" xmlns:w16se="http://schemas.microsoft.com/office/word/2015/wordml/symex" xmlns:wpg="http://schemas.microsoft.com/office/word/2010/wordprocessingGroup" xmlns:wpi="http://schemas.microsoft.com/office/word/2010/wordprocessingInk" xmlns:wne="http://schemas.microsoft.com/office/word/2006/wordml" xmlns:wps="http://schemas.microsoft.com/office/word/2010/wordprocessingShape" mc:Ignorable="w14 w15 w16se w16cid w16 w16cex w16sdtdh wp14">
   <w:p>
     <w:pPr>
       <w:pStyle w:val="Header"/>
@@ -8750,7 +8209,7 @@
         <w:sz w:val="20"/>
         <w:szCs w:val="20"/>
       </w:rPr>
-      <w:t>November 26, 2024</w:t>
+      <w:t>November 27, 2024</w:t>
     </w:r>
     <w:r>
       <w:rPr>
@@ -8824,7 +8283,7 @@
         <w:szCs w:val="20"/>
         <w:highlight w:val="yellow"/>
       </w:rPr>
-      <w:t>John Mosqueda Sr And John Mosqueda Jr</w:t>
+      <w:t>John Mosqueda Sr and John Mosqueda Jr</w:t>
     </w:r>
   </w:p>
   <w:p>
@@ -9023,7 +8482,7 @@
 </file>
 
 <file path=word/header2.xml><?xml version="1.0" encoding="utf-8"?>
-<w:hdr xmlns:wpc="http://schemas.microsoft.com/office/word/2010/wordprocessingCanvas" xmlns:cx="http://schemas.microsoft.com/office/drawing/2014/chartex" xmlns:cx1="http://schemas.microsoft.com/office/drawing/2015/9/8/chartex" xmlns:cx2="http://schemas.microsoft.com/office/drawing/2015/10/21/chartex" xmlns:cx3="http://schemas.microsoft.com/office/drawing/2016/5/9/chartex" xmlns:cx4="http://schemas.microsoft.com/office/drawing/2016/5/10/chartex" xmlns:cx5="http://schemas.microsoft.com/office/drawing/2016/5/11/chartex" xmlns:cx6="http://schemas.microsoft.com/office/drawing/2016/5/12/chartex" xmlns:cx7="http://schemas.microsoft.com/office/drawing/2016/5/13/chartex" xmlns:cx8="http://schemas.microsoft.com/office/drawing/2016/5/14/chartex" xmlns:mc="http://schemas.openxmlformats.org/markup-compatibility/2006" xmlns:aink="http://schemas.microsoft.com/office/drawing/2016/ink" xmlns:am3d="http://schemas.microsoft.com/office/drawing/2017/model3d" xmlns:o="urn:schemas-microsoft-com:office:office" xmlns:oel="http://schemas.microsoft.com/office/2019/extlst" xmlns:r="http://schemas.openxmlformats.org/officeDocument/2006/relationships" xmlns:m="http://schemas.openxmlformats.org/officeDocument/2006/math" xmlns:v="urn:schemas-microsoft-com:vml" xmlns:wp14="http://schemas.microsoft.com/office/word/2010/wordprocessingDrawing" xmlns:wp="http://schemas.openxmlformats.org/drawingml/2006/wordprocessingDrawing" xmlns:w10="urn:schemas-microsoft-com:office:word" xmlns:w="http://schemas.openxmlformats.org/wordprocessingml/2006/main" xmlns:w14="http://schemas.microsoft.com/office/word/2010/wordml" xmlns:w15="http://schemas.microsoft.com/office/word/2012/wordml" xmlns:w16cex="http://schemas.microsoft.com/office/word/2018/wordml/cex" xmlns:w16cid="http://schemas.microsoft.com/office/word/2016/wordml/cid" xmlns:w16="http://schemas.microsoft.com/office/word/2018/wordml" xmlns:w16du="http://schemas.microsoft.com/office/word/2023/wordml/word16du" xmlns:w16sdtdh="http://schemas.microsoft.com/office/word/2020/wordml/sdtdatahash" xmlns:w16se="http://schemas.microsoft.com/office/word/2015/wordml/symex" xmlns:wpg="http://schemas.microsoft.com/office/word/2010/wordprocessingGroup" xmlns:wpi="http://schemas.microsoft.com/office/word/2010/wordprocessingInk" xmlns:wne="http://schemas.microsoft.com/office/word/2006/wordml" xmlns:wps="http://schemas.microsoft.com/office/word/2010/wordprocessingShape" mc:Ignorable="w14 w15 w16se w16cid w16 w16cex w16sdtdh w16du wp14">
+<w:hdr xmlns:wpc="http://schemas.microsoft.com/office/word/2010/wordprocessingCanvas" xmlns:cx="http://schemas.microsoft.com/office/drawing/2014/chartex" xmlns:cx1="http://schemas.microsoft.com/office/drawing/2015/9/8/chartex" xmlns:cx2="http://schemas.microsoft.com/office/drawing/2015/10/21/chartex" xmlns:cx3="http://schemas.microsoft.com/office/drawing/2016/5/9/chartex" xmlns:cx4="http://schemas.microsoft.com/office/drawing/2016/5/10/chartex" xmlns:cx5="http://schemas.microsoft.com/office/drawing/2016/5/11/chartex" xmlns:cx6="http://schemas.microsoft.com/office/drawing/2016/5/12/chartex" xmlns:cx7="http://schemas.microsoft.com/office/drawing/2016/5/13/chartex" xmlns:cx8="http://schemas.microsoft.com/office/drawing/2016/5/14/chartex" xmlns:mc="http://schemas.openxmlformats.org/markup-compatibility/2006" xmlns:aink="http://schemas.microsoft.com/office/drawing/2016/ink" xmlns:am3d="http://schemas.microsoft.com/office/drawing/2017/model3d" xmlns:o="urn:schemas-microsoft-com:office:office" xmlns:oel="http://schemas.microsoft.com/office/2019/extlst" xmlns:r="http://schemas.openxmlformats.org/officeDocument/2006/relationships" xmlns:m="http://schemas.openxmlformats.org/officeDocument/2006/math" xmlns:v="urn:schemas-microsoft-com:vml" xmlns:wp14="http://schemas.microsoft.com/office/word/2010/wordprocessingDrawing" xmlns:wp="http://schemas.openxmlformats.org/drawingml/2006/wordprocessingDrawing" xmlns:w10="urn:schemas-microsoft-com:office:word" xmlns:w="http://schemas.openxmlformats.org/wordprocessingml/2006/main" xmlns:w14="http://schemas.microsoft.com/office/word/2010/wordml" xmlns:w15="http://schemas.microsoft.com/office/word/2012/wordml" xmlns:w16cex="http://schemas.microsoft.com/office/word/2018/wordml/cex" xmlns:w16cid="http://schemas.microsoft.com/office/word/2016/wordml/cid" xmlns:w16="http://schemas.microsoft.com/office/word/2018/wordml" xmlns:w16sdtdh="http://schemas.microsoft.com/office/word/2020/wordml/sdtdatahash" xmlns:w16se="http://schemas.microsoft.com/office/word/2015/wordml/symex" xmlns:wpg="http://schemas.microsoft.com/office/word/2010/wordprocessingGroup" xmlns:wpi="http://schemas.microsoft.com/office/word/2010/wordprocessingInk" xmlns:wne="http://schemas.microsoft.com/office/word/2006/wordml" xmlns:wps="http://schemas.microsoft.com/office/word/2010/wordprocessingShape" mc:Ignorable="w14 w15 w16se w16cid w16 w16cex w16sdtdh wp14">
   <w:tbl>
     <w:tblPr>
       <w:tblStyle w:val="TableGrid"/>
@@ -9477,7 +8936,7 @@
 </file>
 
 <file path=word/numbering.xml><?xml version="1.0" encoding="utf-8"?>
-<w:numbering xmlns:wpc="http://schemas.microsoft.com/office/word/2010/wordprocessingCanvas" xmlns:cx="http://schemas.microsoft.com/office/drawing/2014/chartex" xmlns:cx1="http://schemas.microsoft.com/office/drawing/2015/9/8/chartex" xmlns:cx2="http://schemas.microsoft.com/office/drawing/2015/10/21/chartex" xmlns:cx3="http://schemas.microsoft.com/office/drawing/2016/5/9/chartex" xmlns:cx4="http://schemas.microsoft.com/office/drawing/2016/5/10/chartex" xmlns:cx5="http://schemas.microsoft.com/office/drawing/2016/5/11/chartex" xmlns:cx6="http://schemas.microsoft.com/office/drawing/2016/5/12/chartex" xmlns:cx7="http://schemas.microsoft.com/office/drawing/2016/5/13/chartex" xmlns:cx8="http://schemas.microsoft.com/office/drawing/2016/5/14/chartex" xmlns:mc="http://schemas.openxmlformats.org/markup-compatibility/2006" xmlns:aink="http://schemas.microsoft.com/office/drawing/2016/ink" xmlns:am3d="http://schemas.microsoft.com/office/drawing/2017/model3d" xmlns:o="urn:schemas-microsoft-com:office:office" xmlns:oel="http://schemas.microsoft.com/office/2019/extlst" xmlns:r="http://schemas.openxmlformats.org/officeDocument/2006/relationships" xmlns:m="http://schemas.openxmlformats.org/officeDocument/2006/math" xmlns:v="urn:schemas-microsoft-com:vml" xmlns:wp14="http://schemas.microsoft.com/office/word/2010/wordprocessingDrawing" xmlns:wp="http://schemas.openxmlformats.org/drawingml/2006/wordprocessingDrawing" xmlns:w10="urn:schemas-microsoft-com:office:word" xmlns:w="http://schemas.openxmlformats.org/wordprocessingml/2006/main" xmlns:w14="http://schemas.microsoft.com/office/word/2010/wordml" xmlns:w15="http://schemas.microsoft.com/office/word/2012/wordml" xmlns:w16cex="http://schemas.microsoft.com/office/word/2018/wordml/cex" xmlns:w16cid="http://schemas.microsoft.com/office/word/2016/wordml/cid" xmlns:w16="http://schemas.microsoft.com/office/word/2018/wordml" xmlns:w16du="http://schemas.microsoft.com/office/word/2023/wordml/word16du" xmlns:w16sdtdh="http://schemas.microsoft.com/office/word/2020/wordml/sdtdatahash" xmlns:w16se="http://schemas.microsoft.com/office/word/2015/wordml/symex" xmlns:wpg="http://schemas.microsoft.com/office/word/2010/wordprocessingGroup" xmlns:wpi="http://schemas.microsoft.com/office/word/2010/wordprocessingInk" xmlns:wne="http://schemas.microsoft.com/office/word/2006/wordml" xmlns:wps="http://schemas.microsoft.com/office/word/2010/wordprocessingShape" mc:Ignorable="w14 w15 w16se w16cid w16 w16cex w16sdtdh w16du wp14">
+<w:numbering xmlns:wpc="http://schemas.microsoft.com/office/word/2010/wordprocessingCanvas" xmlns:cx="http://schemas.microsoft.com/office/drawing/2014/chartex" xmlns:cx1="http://schemas.microsoft.com/office/drawing/2015/9/8/chartex" xmlns:cx2="http://schemas.microsoft.com/office/drawing/2015/10/21/chartex" xmlns:cx3="http://schemas.microsoft.com/office/drawing/2016/5/9/chartex" xmlns:cx4="http://schemas.microsoft.com/office/drawing/2016/5/10/chartex" xmlns:cx5="http://schemas.microsoft.com/office/drawing/2016/5/11/chartex" xmlns:cx6="http://schemas.microsoft.com/office/drawing/2016/5/12/chartex" xmlns:cx7="http://schemas.microsoft.com/office/drawing/2016/5/13/chartex" xmlns:cx8="http://schemas.microsoft.com/office/drawing/2016/5/14/chartex" xmlns:mc="http://schemas.openxmlformats.org/markup-compatibility/2006" xmlns:aink="http://schemas.microsoft.com/office/drawing/2016/ink" xmlns:am3d="http://schemas.microsoft.com/office/drawing/2017/model3d" xmlns:o="urn:schemas-microsoft-com:office:office" xmlns:oel="http://schemas.microsoft.com/office/2019/extlst" xmlns:r="http://schemas.openxmlformats.org/officeDocument/2006/relationships" xmlns:m="http://schemas.openxmlformats.org/officeDocument/2006/math" xmlns:v="urn:schemas-microsoft-com:vml" xmlns:wp14="http://schemas.microsoft.com/office/word/2010/wordprocessingDrawing" xmlns:wp="http://schemas.openxmlformats.org/drawingml/2006/wordprocessingDrawing" xmlns:w10="urn:schemas-microsoft-com:office:word" xmlns:w="http://schemas.openxmlformats.org/wordprocessingml/2006/main" xmlns:w14="http://schemas.microsoft.com/office/word/2010/wordml" xmlns:w15="http://schemas.microsoft.com/office/word/2012/wordml" xmlns:w16cex="http://schemas.microsoft.com/office/word/2018/wordml/cex" xmlns:w16cid="http://schemas.microsoft.com/office/word/2016/wordml/cid" xmlns:w16="http://schemas.microsoft.com/office/word/2018/wordml" xmlns:w16sdtdh="http://schemas.microsoft.com/office/word/2020/wordml/sdtdatahash" xmlns:w16se="http://schemas.microsoft.com/office/word/2015/wordml/symex" xmlns:wpg="http://schemas.microsoft.com/office/word/2010/wordprocessingGroup" xmlns:wpi="http://schemas.microsoft.com/office/word/2010/wordprocessingInk" xmlns:wne="http://schemas.microsoft.com/office/word/2006/wordml" xmlns:wps="http://schemas.microsoft.com/office/word/2010/wordprocessingShape" mc:Ignorable="w14 w15 w16se w16cid w16 w16cex w16sdtdh wp14">
   <w:abstractNum w:abstractNumId="0" w15:restartNumberingAfterBreak="0">
     <w:nsid w:val="02040ABA"/>
     <w:multiLevelType w:val="hybridMultilevel"/>
@@ -12687,7 +12146,7 @@
 </file>
 
 <file path=word/styles.xml><?xml version="1.0" encoding="utf-8"?>
-<w:styles xmlns:mc="http://schemas.openxmlformats.org/markup-compatibility/2006" xmlns:r="http://schemas.openxmlformats.org/officeDocument/2006/relationships" xmlns:w="http://schemas.openxmlformats.org/wordprocessingml/2006/main" xmlns:w14="http://schemas.microsoft.com/office/word/2010/wordml" xmlns:w15="http://schemas.microsoft.com/office/word/2012/wordml" xmlns:w16cex="http://schemas.microsoft.com/office/word/2018/wordml/cex" xmlns:w16cid="http://schemas.microsoft.com/office/word/2016/wordml/cid" xmlns:w16="http://schemas.microsoft.com/office/word/2018/wordml" xmlns:w16du="http://schemas.microsoft.com/office/word/2023/wordml/word16du" xmlns:w16sdtdh="http://schemas.microsoft.com/office/word/2020/wordml/sdtdatahash" xmlns:w16se="http://schemas.microsoft.com/office/word/2015/wordml/symex" mc:Ignorable="w14 w15 w16se w16cid w16 w16cex w16sdtdh w16du">
+<w:styles xmlns:mc="http://schemas.openxmlformats.org/markup-compatibility/2006" xmlns:r="http://schemas.openxmlformats.org/officeDocument/2006/relationships" xmlns:w="http://schemas.openxmlformats.org/wordprocessingml/2006/main" xmlns:w14="http://schemas.microsoft.com/office/word/2010/wordml" xmlns:w15="http://schemas.microsoft.com/office/word/2012/wordml" xmlns:w16cex="http://schemas.microsoft.com/office/word/2018/wordml/cex" xmlns:w16cid="http://schemas.microsoft.com/office/word/2016/wordml/cid" xmlns:w16="http://schemas.microsoft.com/office/word/2018/wordml" xmlns:w16sdtdh="http://schemas.microsoft.com/office/word/2020/wordml/sdtdatahash" xmlns:w16se="http://schemas.microsoft.com/office/word/2015/wordml/symex" mc:Ignorable="w14 w15 w16se w16cid w16 w16cex w16sdtdh">
   <w:docDefaults>
     <w:rPrDefault>
       <w:rPr>
@@ -13113,7 +12572,6 @@
   <w:style w:type="character" w:default="1" w:styleId="DefaultParagraphFont">
     <w:name w:val="Default Paragraph Font"/>
     <w:uiPriority w:val="1"/>
-    <w:semiHidden/>
     <w:unhideWhenUsed/>
   </w:style>
   <w:style w:type="table" w:default="1" w:styleId="TableNormal">

</xml_diff>